<commit_message>
Removed extra project folder. Updated Hometask document. Answered question 1-2
</commit_message>
<xml_diff>
--- a/02.LayeredArchitectures/Hometask.docx
+++ b/02.LayeredArchitectures/Hometask.docx
@@ -13,19 +13,7 @@
         <w:rPr>
           <w:rFonts w:ascii="Verdana" w:hAnsi="Verdana"/>
         </w:rPr>
-        <w:t xml:space="preserve">The goal of this module is to provide an overview of the different layered architecture concepts from N-layer to Clean Architecture. Practical tasks include the implementation of the two services with </w:t>
-      </w:r>
-      <w:r>
-        <w:rPr>
-          <w:rFonts w:ascii="Verdana" w:hAnsi="Verdana"/>
-        </w:rPr>
-        <w:t>testability</w:t>
-      </w:r>
-      <w:r>
-        <w:rPr>
-          <w:rFonts w:ascii="Verdana" w:hAnsi="Verdana"/>
-        </w:rPr>
-        <w:t xml:space="preserve"> and extensibility as a non-functional requirement (NFR):</w:t>
+        <w:t>The goal of this module is to provide an overview of the different layered architecture concepts from N-layer to Clean Architecture. Practical tasks include the implementation of the two services with testability and extensibility as a non-functional requirement (NFR):</w:t>
       </w:r>
     </w:p>
     <w:p>
@@ -1043,11 +1031,116 @@
         <w:rPr>
           <w:rFonts w:ascii="Verdana" w:hAnsi="Verdana"/>
         </w:rPr>
-        <w:t xml:space="preserve">Is the below layered architecture correct and why? Is it possible from C to use B? from A to use C? </w:t>
+        <w:t xml:space="preserve">Is the below layered architecture correct and why? Is it possible </w:t>
+      </w:r>
+      <w:proofErr w:type="gramStart"/>
+      <w:r>
+        <w:rPr>
+          <w:rFonts w:ascii="Verdana" w:hAnsi="Verdana"/>
+        </w:rPr>
+        <w:t>from</w:t>
+      </w:r>
+      <w:proofErr w:type="gramEnd"/>
+      <w:r>
+        <w:rPr>
+          <w:rFonts w:ascii="Verdana" w:hAnsi="Verdana"/>
+        </w:rPr>
+        <w:t xml:space="preserve"> C to use B? </w:t>
+      </w:r>
+      <w:proofErr w:type="gramStart"/>
+      <w:r>
+        <w:rPr>
+          <w:rFonts w:ascii="Verdana" w:hAnsi="Verdana"/>
+        </w:rPr>
+        <w:t>from</w:t>
+      </w:r>
+      <w:proofErr w:type="gramEnd"/>
+      <w:r>
+        <w:rPr>
+          <w:rFonts w:ascii="Verdana" w:hAnsi="Verdana"/>
+        </w:rPr>
+        <w:t xml:space="preserve"> A </w:t>
+      </w:r>
+      <w:proofErr w:type="gramStart"/>
+      <w:r>
+        <w:rPr>
+          <w:rFonts w:ascii="Verdana" w:hAnsi="Verdana"/>
+        </w:rPr>
+        <w:t>to use</w:t>
+      </w:r>
+      <w:proofErr w:type="gramEnd"/>
+      <w:r>
+        <w:rPr>
+          <w:rFonts w:ascii="Verdana" w:hAnsi="Verdana"/>
+        </w:rPr>
+        <w:t xml:space="preserve"> C?</w:t>
       </w:r>
       <w:r>
-        <w:rPr>
-          <w:rFonts w:ascii="Verdana" w:hAnsi="Verdana"/>
+        <w:t xml:space="preserve"> </w:t>
+      </w:r>
+      <w:r>
+        <w:rPr>
+          <w:noProof/>
+        </w:rPr>
+        <w:drawing>
+          <wp:inline distT="0" distB="0" distL="0" distR="0" wp14:anchorId="20F64FD4" wp14:editId="0002DB50">
+            <wp:extent cx="5943600" cy="2893695"/>
+            <wp:effectExtent l="0" t="0" r="0" b="1905"/>
+            <wp:docPr id="375297607" name="Picture 2" descr="A diagram of a key&#10;&#10;AI-generated content may be incorrect."/>
+            <wp:cNvGraphicFramePr>
+              <a:graphicFrameLocks xmlns:a="http://schemas.openxmlformats.org/drawingml/2006/main" noChangeAspect="1"/>
+            </wp:cNvGraphicFramePr>
+            <a:graphic xmlns:a="http://schemas.openxmlformats.org/drawingml/2006/main">
+              <a:graphicData uri="http://schemas.openxmlformats.org/drawingml/2006/picture">
+                <pic:pic xmlns:pic="http://schemas.openxmlformats.org/drawingml/2006/picture">
+                  <pic:nvPicPr>
+                    <pic:cNvPr id="375297607" name="Picture 2" descr="A diagram of a key&#10;&#10;AI-generated content may be incorrect."/>
+                    <pic:cNvPicPr>
+                      <a:picLocks noChangeAspect="1" noChangeArrowheads="1"/>
+                    </pic:cNvPicPr>
+                  </pic:nvPicPr>
+                  <pic:blipFill>
+                    <a:blip r:embed="rId7">
+                      <a:extLst>
+                        <a:ext uri="{28A0092B-C50C-407E-A947-70E740481C1C}">
+                          <a14:useLocalDpi xmlns:a14="http://schemas.microsoft.com/office/drawing/2010/main" val="0"/>
+                        </a:ext>
+                      </a:extLst>
+                    </a:blip>
+                    <a:srcRect/>
+                    <a:stretch>
+                      <a:fillRect/>
+                    </a:stretch>
+                  </pic:blipFill>
+                  <pic:spPr bwMode="auto">
+                    <a:xfrm>
+                      <a:off x="0" y="0"/>
+                      <a:ext cx="5943600" cy="2893695"/>
+                    </a:xfrm>
+                    <a:prstGeom prst="rect">
+                      <a:avLst/>
+                    </a:prstGeom>
+                    <a:noFill/>
+                    <a:ln>
+                      <a:noFill/>
+                    </a:ln>
+                  </pic:spPr>
+                </pic:pic>
+              </a:graphicData>
+            </a:graphic>
+          </wp:inline>
+        </w:drawing>
+      </w:r>
+      <w:r>
+        <w:rPr>
+          <w:rFonts w:ascii="Verdana" w:hAnsi="Verdana"/>
+        </w:rPr>
+        <w:t xml:space="preserve"> </w:t>
+      </w:r>
+      <w:r>
+        <w:rPr>
+          <w:rFonts w:ascii="Verdana" w:hAnsi="Verdana"/>
+          <w:noProof/>
         </w:rPr>
         <mc:AlternateContent>
           <mc:Choice Requires="wps">
@@ -1056,7 +1149,7 @@
                 <wp:extent cx="304800" cy="304800"/>
                 <wp:effectExtent l="0" t="0" r="0" b="0"/>
                 <wp:docPr id="552823837" name="Rectangle 6" descr="layers image">
-                  <a:hlinkClick xmlns:a="http://schemas.openxmlformats.org/drawingml/2006/main" r:id="rId7" tgtFrame="&quot;_blank&quot;"/>
+                  <a:hlinkClick xmlns:a="http://schemas.openxmlformats.org/drawingml/2006/main" r:id="rId8" tgtFrame="&quot;_blank&quot;"/>
                 </wp:docPr>
                 <wp:cNvGraphicFramePr>
                   <a:graphicFrameLocks xmlns:a="http://schemas.openxmlformats.org/drawingml/2006/main" noChangeAspect="1"/>
@@ -1172,6 +1265,338 @@
       </w:r>
     </w:p>
     <w:p/>
+    <w:p>
+      <w:pPr>
+        <w:pStyle w:val="Heading1"/>
+        <w:jc w:val="center"/>
+      </w:pPr>
+    </w:p>
+    <w:p/>
+    <w:p>
+      <w:pPr>
+        <w:pStyle w:val="Heading1"/>
+        <w:jc w:val="center"/>
+      </w:pPr>
+      <w:r>
+        <w:lastRenderedPageBreak/>
+        <w:t>Answers</w:t>
+      </w:r>
+    </w:p>
+    <w:p>
+      <w:pPr>
+        <w:jc w:val="center"/>
+        <w:rPr>
+          <w:rFonts w:ascii="Verdana" w:hAnsi="Verdana"/>
+        </w:rPr>
+      </w:pPr>
+    </w:p>
+    <w:p>
+      <w:pPr>
+        <w:numPr>
+          <w:ilvl w:val="0"/>
+          <w:numId w:val="66"/>
+        </w:numPr>
+        <w:rPr>
+          <w:rFonts w:ascii="Verdana" w:hAnsi="Verdana"/>
+        </w:rPr>
+      </w:pPr>
+      <w:r>
+        <w:rPr>
+          <w:rFonts w:ascii="Verdana" w:hAnsi="Verdana"/>
+        </w:rPr>
+        <w:t>Name examples of layered architecture. Do they differ or just extend each other?</w:t>
+      </w:r>
+    </w:p>
+    <w:p>
+      <w:pPr>
+        <w:ind w:left="720"/>
+        <w:rPr>
+          <w:rFonts w:ascii="Verdana" w:hAnsi="Verdana"/>
+        </w:rPr>
+      </w:pPr>
+      <w:r>
+        <w:rPr>
+          <w:rFonts w:ascii="Verdana" w:hAnsi="Verdana"/>
+        </w:rPr>
+        <w:t>Examples of layered architecture: N-tier, Hexagonal,</w:t>
+      </w:r>
+      <w:r>
+        <w:rPr>
+          <w:rFonts w:ascii="Verdana" w:hAnsi="Verdana"/>
+        </w:rPr>
+        <w:t xml:space="preserve"> Onion,</w:t>
+      </w:r>
+      <w:r>
+        <w:rPr>
+          <w:rFonts w:ascii="Verdana" w:hAnsi="Verdana"/>
+        </w:rPr>
+        <w:t xml:space="preserve"> Clean Architecture.</w:t>
+      </w:r>
+      <w:r>
+        <w:rPr>
+          <w:rFonts w:ascii="Verdana" w:hAnsi="Verdana"/>
+        </w:rPr>
+        <w:t xml:space="preserve"> They are all about separation of concerns into layers, the difference is in organizing dependencies. </w:t>
+      </w:r>
+      <w:r>
+        <w:rPr>
+          <w:rFonts w:ascii="Verdana" w:hAnsi="Verdana"/>
+        </w:rPr>
+        <w:t xml:space="preserve">More modern variations like </w:t>
+      </w:r>
+      <w:r>
+        <w:rPr>
+          <w:rFonts w:ascii="Verdana" w:hAnsi="Verdana"/>
+        </w:rPr>
+        <w:t>Onion</w:t>
+      </w:r>
+      <w:r>
+        <w:rPr>
+          <w:rFonts w:ascii="Verdana" w:hAnsi="Verdana"/>
+        </w:rPr>
+        <w:t xml:space="preserve"> and </w:t>
+      </w:r>
+      <w:r>
+        <w:rPr>
+          <w:rFonts w:ascii="Verdana" w:hAnsi="Verdana"/>
+        </w:rPr>
+        <w:t>Clean</w:t>
+      </w:r>
+      <w:r>
+        <w:rPr>
+          <w:rFonts w:ascii="Verdana" w:hAnsi="Verdana"/>
+        </w:rPr>
+        <w:t xml:space="preserve"> </w:t>
+      </w:r>
+      <w:r>
+        <w:rPr>
+          <w:rFonts w:ascii="Verdana" w:hAnsi="Verdana"/>
+        </w:rPr>
+        <w:t>Architecture</w:t>
+      </w:r>
+      <w:r>
+        <w:rPr>
+          <w:rFonts w:ascii="Verdana" w:hAnsi="Verdana"/>
+        </w:rPr>
+        <w:t xml:space="preserve"> use Dependency Inversion Principle</w:t>
+      </w:r>
+      <w:r>
+        <w:rPr>
+          <w:rFonts w:ascii="Verdana" w:hAnsi="Verdana"/>
+        </w:rPr>
+        <w:t>,</w:t>
+      </w:r>
+      <w:r>
+        <w:rPr>
+          <w:rFonts w:ascii="Verdana" w:hAnsi="Verdana"/>
+        </w:rPr>
+        <w:t xml:space="preserve"> isolate domain and are framework independent</w:t>
+      </w:r>
+      <w:r>
+        <w:rPr>
+          <w:rFonts w:ascii="Verdana" w:hAnsi="Verdana"/>
+        </w:rPr>
+        <w:t xml:space="preserve">. </w:t>
+      </w:r>
+      <w:r>
+        <w:rPr>
+          <w:rFonts w:ascii="Verdana" w:hAnsi="Verdana"/>
+        </w:rPr>
+        <w:t>So,</w:t>
+      </w:r>
+      <w:r>
+        <w:rPr>
+          <w:rFonts w:ascii="Verdana" w:hAnsi="Verdana"/>
+        </w:rPr>
+        <w:t xml:space="preserve"> we can consider them as </w:t>
+      </w:r>
+      <w:r>
+        <w:rPr>
+          <w:rFonts w:ascii="Verdana" w:hAnsi="Verdana"/>
+        </w:rPr>
+        <w:t>modernized, strict versions</w:t>
+      </w:r>
+      <w:r>
+        <w:rPr>
+          <w:rFonts w:ascii="Verdana" w:hAnsi="Verdana"/>
+        </w:rPr>
+        <w:t xml:space="preserve"> of initial </w:t>
+      </w:r>
+      <w:r>
+        <w:rPr>
+          <w:rFonts w:ascii="Verdana" w:hAnsi="Verdana"/>
+        </w:rPr>
+        <w:t>N-tier</w:t>
+      </w:r>
+      <w:r>
+        <w:rPr>
+          <w:rFonts w:ascii="Verdana" w:hAnsi="Verdana"/>
+        </w:rPr>
+        <w:t xml:space="preserve"> architecture.</w:t>
+      </w:r>
+    </w:p>
+    <w:p>
+      <w:pPr>
+        <w:pStyle w:val="ListParagraph"/>
+        <w:numPr>
+          <w:ilvl w:val="0"/>
+          <w:numId w:val="66"/>
+        </w:numPr>
+        <w:rPr>
+          <w:rFonts w:ascii="Verdana" w:hAnsi="Verdana"/>
+        </w:rPr>
+      </w:pPr>
+      <w:r>
+        <w:rPr>
+          <w:rFonts w:ascii="Verdana" w:hAnsi="Verdana"/>
+        </w:rPr>
+        <w:t xml:space="preserve">Is the below layered architecture correct and why? Is it possible </w:t>
+      </w:r>
+      <w:proofErr w:type="gramStart"/>
+      <w:r>
+        <w:rPr>
+          <w:rFonts w:ascii="Verdana" w:hAnsi="Verdana"/>
+        </w:rPr>
+        <w:t>from</w:t>
+      </w:r>
+      <w:proofErr w:type="gramEnd"/>
+      <w:r>
+        <w:rPr>
+          <w:rFonts w:ascii="Verdana" w:hAnsi="Verdana"/>
+        </w:rPr>
+        <w:t xml:space="preserve"> C to use B? from A to use C?</w:t>
+      </w:r>
+    </w:p>
+    <w:p>
+      <w:pPr>
+        <w:pStyle w:val="ListParagraph"/>
+        <w:rPr>
+          <w:rFonts w:ascii="Verdana" w:hAnsi="Verdana"/>
+        </w:rPr>
+      </w:pPr>
+      <w:r>
+        <w:rPr>
+          <w:rFonts w:ascii="Verdana" w:hAnsi="Verdana"/>
+        </w:rPr>
+        <w:t xml:space="preserve">If all three layers are closed, then this layered architecture is incorrect because lower layers should not depend on higher ones. A closed layer means that, as a request moves from layer to layer, it must go through the layer directly below it to reach the next one. The correct flow should be A </w:t>
+      </w:r>
+      <w:r>
+        <w:rPr>
+          <w:rFonts w:ascii="Arial" w:hAnsi="Arial" w:cs="Arial"/>
+        </w:rPr>
+        <w:t>→</w:t>
+      </w:r>
+      <w:r>
+        <w:rPr>
+          <w:rFonts w:ascii="Verdana" w:hAnsi="Verdana"/>
+        </w:rPr>
+        <w:t xml:space="preserve"> B </w:t>
+      </w:r>
+      <w:r>
+        <w:rPr>
+          <w:rFonts w:ascii="Arial" w:hAnsi="Arial" w:cs="Arial"/>
+        </w:rPr>
+        <w:t>→</w:t>
+      </w:r>
+      <w:r>
+        <w:rPr>
+          <w:rFonts w:ascii="Verdana" w:hAnsi="Verdana"/>
+        </w:rPr>
+        <w:t xml:space="preserve"> C, so it is not possible for C to use B or for A to use C directly.</w:t>
+      </w:r>
+      <w:r>
+        <w:rPr>
+          <w:rFonts w:ascii="Verdana" w:hAnsi="Verdana"/>
+        </w:rPr>
+        <w:t xml:space="preserve"> </w:t>
+      </w:r>
+      <w:r>
+        <w:rPr>
+          <w:rFonts w:ascii="Verdana" w:hAnsi="Verdana"/>
+        </w:rPr>
+        <w:t xml:space="preserve">If the architecture used an open layer approach, A </w:t>
+      </w:r>
+      <w:r>
+        <w:rPr>
+          <w:rFonts w:ascii="Arial" w:hAnsi="Arial" w:cs="Arial"/>
+        </w:rPr>
+        <w:t>→</w:t>
+      </w:r>
+      <w:r>
+        <w:rPr>
+          <w:rFonts w:ascii="Verdana" w:hAnsi="Verdana"/>
+        </w:rPr>
+        <w:t xml:space="preserve"> C could be valid (skipping B), but lower-to-upper calls (e.g., C </w:t>
+      </w:r>
+      <w:r>
+        <w:rPr>
+          <w:rFonts w:ascii="Arial" w:hAnsi="Arial" w:cs="Arial"/>
+        </w:rPr>
+        <w:t>→</w:t>
+      </w:r>
+      <w:r>
+        <w:rPr>
+          <w:rFonts w:ascii="Verdana" w:hAnsi="Verdana"/>
+        </w:rPr>
+        <w:t xml:space="preserve"> B or C </w:t>
+      </w:r>
+      <w:r>
+        <w:rPr>
+          <w:rFonts w:ascii="Arial" w:hAnsi="Arial" w:cs="Arial"/>
+        </w:rPr>
+        <w:t>→</w:t>
+      </w:r>
+      <w:r>
+        <w:rPr>
+          <w:rFonts w:ascii="Verdana" w:hAnsi="Verdana"/>
+        </w:rPr>
+        <w:t xml:space="preserve"> A) would still violate the dependency direction principle.</w:t>
+      </w:r>
+    </w:p>
+    <w:p>
+      <w:pPr>
+        <w:pStyle w:val="ListParagraph"/>
+        <w:numPr>
+          <w:ilvl w:val="0"/>
+          <w:numId w:val="66"/>
+        </w:numPr>
+        <w:rPr>
+          <w:rFonts w:ascii="Verdana" w:hAnsi="Verdana"/>
+        </w:rPr>
+      </w:pPr>
+      <w:r>
+        <w:rPr>
+          <w:rFonts w:ascii="Verdana" w:hAnsi="Verdana"/>
+        </w:rPr>
+        <w:t>Is DDD a type of layered architecture? What is Anemic model? Is it really an antipattern?</w:t>
+      </w:r>
+    </w:p>
+    <w:p>
+      <w:pPr>
+        <w:rPr>
+          <w:rFonts w:ascii="Verdana" w:hAnsi="Verdana"/>
+        </w:rPr>
+      </w:pPr>
+    </w:p>
+    <w:p>
+      <w:pPr>
+        <w:rPr>
+          <w:rFonts w:ascii="Verdana" w:hAnsi="Verdana"/>
+        </w:rPr>
+      </w:pPr>
+    </w:p>
+    <w:p>
+      <w:pPr>
+        <w:rPr>
+          <w:rFonts w:ascii="Verdana" w:hAnsi="Verdana"/>
+        </w:rPr>
+      </w:pPr>
+    </w:p>
+    <w:p>
+      <w:pPr>
+        <w:jc w:val="both"/>
+      </w:pPr>
+    </w:p>
     <w:sectPr>
       <w:pgSz w:w="12240" w:h="15840"/>
       <w:pgMar w:top="1440" w:right="1440" w:bottom="1440" w:left="1440" w:header="720" w:footer="720" w:gutter="0"/>
@@ -6904,6 +7329,119 @@
     </w:lvl>
   </w:abstractNum>
   <w:abstractNum w:abstractNumId="41" w15:restartNumberingAfterBreak="0">
+    <w:nsid w:val="48DF548A"/>
+    <w:multiLevelType w:val="multilevel"/>
+    <w:tmpl w:val="495A97C4"/>
+    <w:lvl w:ilvl="0">
+      <w:start w:val="1"/>
+      <w:numFmt w:val="decimal"/>
+      <w:lvlText w:val="%1."/>
+      <w:lvlJc w:val="left"/>
+      <w:pPr>
+        <w:tabs>
+          <w:tab w:val="num" w:pos="720"/>
+        </w:tabs>
+        <w:ind w:left="720" w:hanging="360"/>
+      </w:pPr>
+    </w:lvl>
+    <w:lvl w:ilvl="1">
+      <w:start w:val="1"/>
+      <w:numFmt w:val="decimal"/>
+      <w:lvlText w:val="%2."/>
+      <w:lvlJc w:val="left"/>
+      <w:pPr>
+        <w:tabs>
+          <w:tab w:val="num" w:pos="1440"/>
+        </w:tabs>
+        <w:ind w:left="1440" w:hanging="360"/>
+      </w:pPr>
+    </w:lvl>
+    <w:lvl w:ilvl="2" w:tentative="1">
+      <w:start w:val="1"/>
+      <w:numFmt w:val="decimal"/>
+      <w:lvlText w:val="%3."/>
+      <w:lvlJc w:val="left"/>
+      <w:pPr>
+        <w:tabs>
+          <w:tab w:val="num" w:pos="2160"/>
+        </w:tabs>
+        <w:ind w:left="2160" w:hanging="360"/>
+      </w:pPr>
+    </w:lvl>
+    <w:lvl w:ilvl="3" w:tentative="1">
+      <w:start w:val="1"/>
+      <w:numFmt w:val="decimal"/>
+      <w:lvlText w:val="%4."/>
+      <w:lvlJc w:val="left"/>
+      <w:pPr>
+        <w:tabs>
+          <w:tab w:val="num" w:pos="2880"/>
+        </w:tabs>
+        <w:ind w:left="2880" w:hanging="360"/>
+      </w:pPr>
+    </w:lvl>
+    <w:lvl w:ilvl="4" w:tentative="1">
+      <w:start w:val="1"/>
+      <w:numFmt w:val="decimal"/>
+      <w:lvlText w:val="%5."/>
+      <w:lvlJc w:val="left"/>
+      <w:pPr>
+        <w:tabs>
+          <w:tab w:val="num" w:pos="3600"/>
+        </w:tabs>
+        <w:ind w:left="3600" w:hanging="360"/>
+      </w:pPr>
+    </w:lvl>
+    <w:lvl w:ilvl="5" w:tentative="1">
+      <w:start w:val="1"/>
+      <w:numFmt w:val="decimal"/>
+      <w:lvlText w:val="%6."/>
+      <w:lvlJc w:val="left"/>
+      <w:pPr>
+        <w:tabs>
+          <w:tab w:val="num" w:pos="4320"/>
+        </w:tabs>
+        <w:ind w:left="4320" w:hanging="360"/>
+      </w:pPr>
+    </w:lvl>
+    <w:lvl w:ilvl="6" w:tentative="1">
+      <w:start w:val="1"/>
+      <w:numFmt w:val="decimal"/>
+      <w:lvlText w:val="%7."/>
+      <w:lvlJc w:val="left"/>
+      <w:pPr>
+        <w:tabs>
+          <w:tab w:val="num" w:pos="5040"/>
+        </w:tabs>
+        <w:ind w:left="5040" w:hanging="360"/>
+      </w:pPr>
+    </w:lvl>
+    <w:lvl w:ilvl="7" w:tentative="1">
+      <w:start w:val="1"/>
+      <w:numFmt w:val="decimal"/>
+      <w:lvlText w:val="%8."/>
+      <w:lvlJc w:val="left"/>
+      <w:pPr>
+        <w:tabs>
+          <w:tab w:val="num" w:pos="5760"/>
+        </w:tabs>
+        <w:ind w:left="5760" w:hanging="360"/>
+      </w:pPr>
+    </w:lvl>
+    <w:lvl w:ilvl="8" w:tentative="1">
+      <w:start w:val="1"/>
+      <w:numFmt w:val="decimal"/>
+      <w:lvlText w:val="%9."/>
+      <w:lvlJc w:val="left"/>
+      <w:pPr>
+        <w:tabs>
+          <w:tab w:val="num" w:pos="6480"/>
+        </w:tabs>
+        <w:ind w:left="6480" w:hanging="360"/>
+      </w:pPr>
+    </w:lvl>
+  </w:abstractNum>
+  <w:abstractNum w:abstractNumId="42" w15:restartNumberingAfterBreak="0">
     <w:nsid w:val="4AAA15B9"/>
     <w:multiLevelType w:val="multilevel"/>
     <w:tmpl w:val="439C1A66"/>
@@ -7052,7 +7590,7 @@
       </w:rPr>
     </w:lvl>
   </w:abstractNum>
-  <w:abstractNum w:abstractNumId="42" w15:restartNumberingAfterBreak="0">
+  <w:abstractNum w:abstractNumId="43" w15:restartNumberingAfterBreak="0">
     <w:nsid w:val="4D1F5B68"/>
     <w:multiLevelType w:val="multilevel"/>
     <w:tmpl w:val="D22EEDD4"/>
@@ -7198,7 +7736,7 @@
       </w:rPr>
     </w:lvl>
   </w:abstractNum>
-  <w:abstractNum w:abstractNumId="43" w15:restartNumberingAfterBreak="0">
+  <w:abstractNum w:abstractNumId="44" w15:restartNumberingAfterBreak="0">
     <w:nsid w:val="512B1A69"/>
     <w:multiLevelType w:val="multilevel"/>
     <w:tmpl w:val="D22EEDD4"/>
@@ -7345,7 +7883,7 @@
       </w:rPr>
     </w:lvl>
   </w:abstractNum>
-  <w:abstractNum w:abstractNumId="44" w15:restartNumberingAfterBreak="0">
+  <w:abstractNum w:abstractNumId="45" w15:restartNumberingAfterBreak="0">
     <w:nsid w:val="541034EF"/>
     <w:multiLevelType w:val="multilevel"/>
     <w:tmpl w:val="4B44D176"/>
@@ -7458,7 +7996,7 @@
       </w:pPr>
     </w:lvl>
   </w:abstractNum>
-  <w:abstractNum w:abstractNumId="45" w15:restartNumberingAfterBreak="0">
+  <w:abstractNum w:abstractNumId="46" w15:restartNumberingAfterBreak="0">
     <w:nsid w:val="58FF7E3E"/>
     <w:multiLevelType w:val="multilevel"/>
     <w:tmpl w:val="AD5C1AB4"/>
@@ -7607,7 +8145,7 @@
       </w:rPr>
     </w:lvl>
   </w:abstractNum>
-  <w:abstractNum w:abstractNumId="46" w15:restartNumberingAfterBreak="0">
+  <w:abstractNum w:abstractNumId="47" w15:restartNumberingAfterBreak="0">
     <w:nsid w:val="5B5464AE"/>
     <w:multiLevelType w:val="multilevel"/>
     <w:tmpl w:val="D22EEDD4"/>
@@ -7754,7 +8292,7 @@
       </w:rPr>
     </w:lvl>
   </w:abstractNum>
-  <w:abstractNum w:abstractNumId="47" w15:restartNumberingAfterBreak="0">
+  <w:abstractNum w:abstractNumId="48" w15:restartNumberingAfterBreak="0">
     <w:nsid w:val="5E314008"/>
     <w:multiLevelType w:val="hybridMultilevel"/>
     <w:tmpl w:val="70A4C462"/>
@@ -7867,7 +8405,7 @@
       </w:rPr>
     </w:lvl>
   </w:abstractNum>
-  <w:abstractNum w:abstractNumId="48" w15:restartNumberingAfterBreak="0">
+  <w:abstractNum w:abstractNumId="49" w15:restartNumberingAfterBreak="0">
     <w:nsid w:val="61205947"/>
     <w:multiLevelType w:val="multilevel"/>
     <w:tmpl w:val="F5B001F2"/>
@@ -8019,7 +8557,7 @@
       </w:rPr>
     </w:lvl>
   </w:abstractNum>
-  <w:abstractNum w:abstractNumId="49" w15:restartNumberingAfterBreak="0">
+  <w:abstractNum w:abstractNumId="50" w15:restartNumberingAfterBreak="0">
     <w:nsid w:val="62F77B29"/>
     <w:multiLevelType w:val="multilevel"/>
     <w:tmpl w:val="D22EEDD4"/>
@@ -8165,7 +8703,7 @@
       </w:rPr>
     </w:lvl>
   </w:abstractNum>
-  <w:abstractNum w:abstractNumId="50" w15:restartNumberingAfterBreak="0">
+  <w:abstractNum w:abstractNumId="51" w15:restartNumberingAfterBreak="0">
     <w:nsid w:val="63DA71CA"/>
     <w:multiLevelType w:val="hybridMultilevel"/>
     <w:tmpl w:val="59207FBC"/>
@@ -8278,7 +8816,7 @@
       </w:rPr>
     </w:lvl>
   </w:abstractNum>
-  <w:abstractNum w:abstractNumId="51" w15:restartNumberingAfterBreak="0">
+  <w:abstractNum w:abstractNumId="52" w15:restartNumberingAfterBreak="0">
     <w:nsid w:val="6622768E"/>
     <w:multiLevelType w:val="multilevel"/>
     <w:tmpl w:val="DBA01C36"/>
@@ -8427,7 +8965,7 @@
       </w:rPr>
     </w:lvl>
   </w:abstractNum>
-  <w:abstractNum w:abstractNumId="52" w15:restartNumberingAfterBreak="0">
+  <w:abstractNum w:abstractNumId="53" w15:restartNumberingAfterBreak="0">
     <w:nsid w:val="664537F2"/>
     <w:multiLevelType w:val="multilevel"/>
     <w:tmpl w:val="1DD84828"/>
@@ -8576,7 +9114,7 @@
       </w:rPr>
     </w:lvl>
   </w:abstractNum>
-  <w:abstractNum w:abstractNumId="53" w15:restartNumberingAfterBreak="0">
+  <w:abstractNum w:abstractNumId="54" w15:restartNumberingAfterBreak="0">
     <w:nsid w:val="665D5A91"/>
     <w:multiLevelType w:val="multilevel"/>
     <w:tmpl w:val="4B44D176"/>
@@ -8689,7 +9227,7 @@
       </w:pPr>
     </w:lvl>
   </w:abstractNum>
-  <w:abstractNum w:abstractNumId="54" w15:restartNumberingAfterBreak="0">
+  <w:abstractNum w:abstractNumId="55" w15:restartNumberingAfterBreak="0">
     <w:nsid w:val="67A90D49"/>
     <w:multiLevelType w:val="multilevel"/>
     <w:tmpl w:val="9BE04700"/>
@@ -8838,7 +9376,7 @@
       </w:rPr>
     </w:lvl>
   </w:abstractNum>
-  <w:abstractNum w:abstractNumId="55" w15:restartNumberingAfterBreak="0">
+  <w:abstractNum w:abstractNumId="56" w15:restartNumberingAfterBreak="0">
     <w:nsid w:val="68392B11"/>
     <w:multiLevelType w:val="multilevel"/>
     <w:tmpl w:val="AD5C1AB4"/>
@@ -8987,7 +9525,7 @@
       </w:rPr>
     </w:lvl>
   </w:abstractNum>
-  <w:abstractNum w:abstractNumId="56" w15:restartNumberingAfterBreak="0">
+  <w:abstractNum w:abstractNumId="57" w15:restartNumberingAfterBreak="0">
     <w:nsid w:val="69A94463"/>
     <w:multiLevelType w:val="multilevel"/>
     <w:tmpl w:val="4B44D176"/>
@@ -9104,7 +9642,7 @@
       </w:pPr>
     </w:lvl>
   </w:abstractNum>
-  <w:abstractNum w:abstractNumId="57" w15:restartNumberingAfterBreak="0">
+  <w:abstractNum w:abstractNumId="58" w15:restartNumberingAfterBreak="0">
     <w:nsid w:val="6AE76E32"/>
     <w:multiLevelType w:val="multilevel"/>
     <w:tmpl w:val="6CA8E43C"/>
@@ -9217,7 +9755,7 @@
       </w:pPr>
     </w:lvl>
   </w:abstractNum>
-  <w:abstractNum w:abstractNumId="58" w15:restartNumberingAfterBreak="0">
+  <w:abstractNum w:abstractNumId="59" w15:restartNumberingAfterBreak="0">
     <w:nsid w:val="6BC53E38"/>
     <w:multiLevelType w:val="multilevel"/>
     <w:tmpl w:val="33B0617A"/>
@@ -9366,7 +9904,7 @@
       </w:rPr>
     </w:lvl>
   </w:abstractNum>
-  <w:abstractNum w:abstractNumId="59" w15:restartNumberingAfterBreak="0">
+  <w:abstractNum w:abstractNumId="60" w15:restartNumberingAfterBreak="0">
     <w:nsid w:val="73056118"/>
     <w:multiLevelType w:val="multilevel"/>
     <w:tmpl w:val="D22EEDD4"/>
@@ -9512,7 +10050,7 @@
       </w:rPr>
     </w:lvl>
   </w:abstractNum>
-  <w:abstractNum w:abstractNumId="60" w15:restartNumberingAfterBreak="0">
+  <w:abstractNum w:abstractNumId="61" w15:restartNumberingAfterBreak="0">
     <w:nsid w:val="749C58B3"/>
     <w:multiLevelType w:val="multilevel"/>
     <w:tmpl w:val="15AEF154"/>
@@ -9661,7 +10199,7 @@
       </w:rPr>
     </w:lvl>
   </w:abstractNum>
-  <w:abstractNum w:abstractNumId="61" w15:restartNumberingAfterBreak="0">
+  <w:abstractNum w:abstractNumId="62" w15:restartNumberingAfterBreak="0">
     <w:nsid w:val="77C353D4"/>
     <w:multiLevelType w:val="multilevel"/>
     <w:tmpl w:val="828A4E80"/>
@@ -9810,7 +10348,7 @@
       </w:rPr>
     </w:lvl>
   </w:abstractNum>
-  <w:abstractNum w:abstractNumId="62" w15:restartNumberingAfterBreak="0">
+  <w:abstractNum w:abstractNumId="63" w15:restartNumberingAfterBreak="0">
     <w:nsid w:val="78552A01"/>
     <w:multiLevelType w:val="multilevel"/>
     <w:tmpl w:val="3556A2CC"/>
@@ -9959,7 +10497,7 @@
       </w:rPr>
     </w:lvl>
   </w:abstractNum>
-  <w:abstractNum w:abstractNumId="63" w15:restartNumberingAfterBreak="0">
+  <w:abstractNum w:abstractNumId="64" w15:restartNumberingAfterBreak="0">
     <w:nsid w:val="7C617400"/>
     <w:multiLevelType w:val="multilevel"/>
     <w:tmpl w:val="0E646272"/>
@@ -10106,6 +10644,92 @@
         <w:rFonts w:ascii="Symbol" w:hAnsi="Symbol" w:hint="default"/>
         <w:sz w:val="20"/>
       </w:rPr>
+    </w:lvl>
+  </w:abstractNum>
+  <w:abstractNum w:abstractNumId="65" w15:restartNumberingAfterBreak="0">
+    <w:nsid w:val="7F053E82"/>
+    <w:multiLevelType w:val="hybridMultilevel"/>
+    <w:tmpl w:val="8C28640A"/>
+    <w:lvl w:ilvl="0" w:tplc="0409000F">
+      <w:start w:val="1"/>
+      <w:numFmt w:val="decimal"/>
+      <w:lvlText w:val="%1."/>
+      <w:lvlJc w:val="left"/>
+      <w:pPr>
+        <w:ind w:left="720" w:hanging="360"/>
+      </w:pPr>
+    </w:lvl>
+    <w:lvl w:ilvl="1" w:tplc="04090019" w:tentative="1">
+      <w:start w:val="1"/>
+      <w:numFmt w:val="lowerLetter"/>
+      <w:lvlText w:val="%2."/>
+      <w:lvlJc w:val="left"/>
+      <w:pPr>
+        <w:ind w:left="1440" w:hanging="360"/>
+      </w:pPr>
+    </w:lvl>
+    <w:lvl w:ilvl="2" w:tplc="0409001B" w:tentative="1">
+      <w:start w:val="1"/>
+      <w:numFmt w:val="lowerRoman"/>
+      <w:lvlText w:val="%3."/>
+      <w:lvlJc w:val="right"/>
+      <w:pPr>
+        <w:ind w:left="2160" w:hanging="180"/>
+      </w:pPr>
+    </w:lvl>
+    <w:lvl w:ilvl="3" w:tplc="0409000F" w:tentative="1">
+      <w:start w:val="1"/>
+      <w:numFmt w:val="decimal"/>
+      <w:lvlText w:val="%4."/>
+      <w:lvlJc w:val="left"/>
+      <w:pPr>
+        <w:ind w:left="2880" w:hanging="360"/>
+      </w:pPr>
+    </w:lvl>
+    <w:lvl w:ilvl="4" w:tplc="04090019" w:tentative="1">
+      <w:start w:val="1"/>
+      <w:numFmt w:val="lowerLetter"/>
+      <w:lvlText w:val="%5."/>
+      <w:lvlJc w:val="left"/>
+      <w:pPr>
+        <w:ind w:left="3600" w:hanging="360"/>
+      </w:pPr>
+    </w:lvl>
+    <w:lvl w:ilvl="5" w:tplc="0409001B" w:tentative="1">
+      <w:start w:val="1"/>
+      <w:numFmt w:val="lowerRoman"/>
+      <w:lvlText w:val="%6."/>
+      <w:lvlJc w:val="right"/>
+      <w:pPr>
+        <w:ind w:left="4320" w:hanging="180"/>
+      </w:pPr>
+    </w:lvl>
+    <w:lvl w:ilvl="6" w:tplc="0409000F" w:tentative="1">
+      <w:start w:val="1"/>
+      <w:numFmt w:val="decimal"/>
+      <w:lvlText w:val="%7."/>
+      <w:lvlJc w:val="left"/>
+      <w:pPr>
+        <w:ind w:left="5040" w:hanging="360"/>
+      </w:pPr>
+    </w:lvl>
+    <w:lvl w:ilvl="7" w:tplc="04090019" w:tentative="1">
+      <w:start w:val="1"/>
+      <w:numFmt w:val="lowerLetter"/>
+      <w:lvlText w:val="%8."/>
+      <w:lvlJc w:val="left"/>
+      <w:pPr>
+        <w:ind w:left="5760" w:hanging="360"/>
+      </w:pPr>
+    </w:lvl>
+    <w:lvl w:ilvl="8" w:tplc="0409001B" w:tentative="1">
+      <w:start w:val="1"/>
+      <w:numFmt w:val="lowerRoman"/>
+      <w:lvlText w:val="%9."/>
+      <w:lvlJc w:val="right"/>
+      <w:pPr>
+        <w:ind w:left="6480" w:hanging="180"/>
+      </w:pPr>
     </w:lvl>
   </w:abstractNum>
   <w:num w:numId="1" w16cid:durableId="1297174915">
@@ -10115,7 +10739,7 @@
     <w:abstractNumId w:val="32"/>
   </w:num>
   <w:num w:numId="3" w16cid:durableId="360715682">
-    <w:abstractNumId w:val="53"/>
+    <w:abstractNumId w:val="54"/>
   </w:num>
   <w:num w:numId="4" w16cid:durableId="228272565">
     <w:abstractNumId w:val="39"/>
@@ -10130,13 +10754,13 @@
     <w:abstractNumId w:val="37"/>
   </w:num>
   <w:num w:numId="8" w16cid:durableId="647629789">
-    <w:abstractNumId w:val="47"/>
+    <w:abstractNumId w:val="48"/>
   </w:num>
   <w:num w:numId="9" w16cid:durableId="1202061867">
-    <w:abstractNumId w:val="56"/>
+    <w:abstractNumId w:val="57"/>
   </w:num>
   <w:num w:numId="10" w16cid:durableId="156767161">
-    <w:abstractNumId w:val="44"/>
+    <w:abstractNumId w:val="45"/>
   </w:num>
   <w:num w:numId="11" w16cid:durableId="2011058566">
     <w:abstractNumId w:val="5"/>
@@ -10160,7 +10784,7 @@
     <w:abstractNumId w:val="20"/>
   </w:num>
   <w:num w:numId="18" w16cid:durableId="60445195">
-    <w:abstractNumId w:val="58"/>
+    <w:abstractNumId w:val="59"/>
   </w:num>
   <w:num w:numId="19" w16cid:durableId="330724267">
     <w:abstractNumId w:val="7"/>
@@ -10172,10 +10796,10 @@
     <w:abstractNumId w:val="0"/>
   </w:num>
   <w:num w:numId="22" w16cid:durableId="546261803">
-    <w:abstractNumId w:val="54"/>
+    <w:abstractNumId w:val="55"/>
   </w:num>
   <w:num w:numId="23" w16cid:durableId="498816192">
-    <w:abstractNumId w:val="63"/>
+    <w:abstractNumId w:val="64"/>
   </w:num>
   <w:num w:numId="24" w16cid:durableId="1161699020">
     <w:abstractNumId w:val="15"/>
@@ -10184,19 +10808,19 @@
     <w:abstractNumId w:val="35"/>
   </w:num>
   <w:num w:numId="26" w16cid:durableId="1188525470">
-    <w:abstractNumId w:val="51"/>
+    <w:abstractNumId w:val="52"/>
   </w:num>
   <w:num w:numId="27" w16cid:durableId="1322349861">
     <w:abstractNumId w:val="8"/>
   </w:num>
   <w:num w:numId="28" w16cid:durableId="1556546658">
-    <w:abstractNumId w:val="52"/>
+    <w:abstractNumId w:val="53"/>
   </w:num>
   <w:num w:numId="29" w16cid:durableId="186598607">
-    <w:abstractNumId w:val="41"/>
+    <w:abstractNumId w:val="42"/>
   </w:num>
   <w:num w:numId="30" w16cid:durableId="103154515">
-    <w:abstractNumId w:val="62"/>
+    <w:abstractNumId w:val="63"/>
   </w:num>
   <w:num w:numId="31" w16cid:durableId="1876428101">
     <w:abstractNumId w:val="38"/>
@@ -10208,7 +10832,7 @@
     <w:abstractNumId w:val="33"/>
   </w:num>
   <w:num w:numId="34" w16cid:durableId="1570192368">
-    <w:abstractNumId w:val="48"/>
+    <w:abstractNumId w:val="49"/>
   </w:num>
   <w:num w:numId="35" w16cid:durableId="1678651459">
     <w:abstractNumId w:val="26"/>
@@ -10220,10 +10844,10 @@
     <w:abstractNumId w:val="16"/>
   </w:num>
   <w:num w:numId="38" w16cid:durableId="966622559">
-    <w:abstractNumId w:val="45"/>
+    <w:abstractNumId w:val="46"/>
   </w:num>
   <w:num w:numId="39" w16cid:durableId="513543315">
-    <w:abstractNumId w:val="55"/>
+    <w:abstractNumId w:val="56"/>
   </w:num>
   <w:num w:numId="40" w16cid:durableId="137847652">
     <w:abstractNumId w:val="10"/>
@@ -10232,7 +10856,7 @@
     <w:abstractNumId w:val="28"/>
   </w:num>
   <w:num w:numId="42" w16cid:durableId="125053502">
-    <w:abstractNumId w:val="46"/>
+    <w:abstractNumId w:val="47"/>
   </w:num>
   <w:num w:numId="43" w16cid:durableId="369258724">
     <w:abstractNumId w:val="34"/>
@@ -10241,7 +10865,7 @@
     <w:abstractNumId w:val="22"/>
   </w:num>
   <w:num w:numId="45" w16cid:durableId="824706685">
-    <w:abstractNumId w:val="43"/>
+    <w:abstractNumId w:val="44"/>
   </w:num>
   <w:num w:numId="46" w16cid:durableId="144392399">
     <w:abstractNumId w:val="14"/>
@@ -10250,10 +10874,10 @@
     <w:abstractNumId w:val="9"/>
   </w:num>
   <w:num w:numId="48" w16cid:durableId="1468012858">
-    <w:abstractNumId w:val="60"/>
+    <w:abstractNumId w:val="61"/>
   </w:num>
   <w:num w:numId="49" w16cid:durableId="2013754073">
-    <w:abstractNumId w:val="61"/>
+    <w:abstractNumId w:val="62"/>
   </w:num>
   <w:num w:numId="50" w16cid:durableId="1994328295">
     <w:abstractNumId w:val="29"/>
@@ -10262,19 +10886,19 @@
     <w:abstractNumId w:val="19"/>
   </w:num>
   <w:num w:numId="52" w16cid:durableId="1794517537">
+    <w:abstractNumId w:val="51"/>
+  </w:num>
+  <w:num w:numId="53" w16cid:durableId="1437946667">
     <w:abstractNumId w:val="50"/>
   </w:num>
-  <w:num w:numId="53" w16cid:durableId="1437946667">
-    <w:abstractNumId w:val="49"/>
-  </w:num>
   <w:num w:numId="54" w16cid:durableId="1298335770">
-    <w:abstractNumId w:val="59"/>
+    <w:abstractNumId w:val="60"/>
   </w:num>
   <w:num w:numId="55" w16cid:durableId="151532050">
     <w:abstractNumId w:val="13"/>
   </w:num>
   <w:num w:numId="56" w16cid:durableId="1444615297">
-    <w:abstractNumId w:val="42"/>
+    <w:abstractNumId w:val="43"/>
   </w:num>
   <w:num w:numId="57" w16cid:durableId="1548102677">
     <w:abstractNumId w:val="18"/>
@@ -10283,7 +10907,7 @@
     <w:abstractNumId w:val="17"/>
   </w:num>
   <w:num w:numId="59" w16cid:durableId="656760562">
-    <w:abstractNumId w:val="57"/>
+    <w:abstractNumId w:val="58"/>
   </w:num>
   <w:num w:numId="60" w16cid:durableId="1925912153">
     <w:abstractNumId w:val="24"/>
@@ -10319,6 +10943,12 @@
   </w:num>
   <w:num w:numId="65" w16cid:durableId="1585914580">
     <w:abstractNumId w:val="4"/>
+  </w:num>
+  <w:num w:numId="66" w16cid:durableId="2085495234">
+    <w:abstractNumId w:val="41"/>
+  </w:num>
+  <w:num w:numId="67" w16cid:durableId="1819151747">
+    <w:abstractNumId w:val="65"/>
   </w:num>
 </w:numbering>
 </file>
@@ -10723,7 +11353,7 @@
   <w:style w:type="paragraph" w:default="1" w:styleId="Normal">
     <w:name w:val="Normal"/>
     <w:qFormat/>
-    <w:rsid w:val="00C10958"/>
+    <w:rsid w:val="00B920E5"/>
   </w:style>
   <w:style w:type="paragraph" w:styleId="Heading1">
     <w:name w:val="heading 1"/>

</xml_diff>

<commit_message>
Updated Hometask document. Answered questions 3-5
</commit_message>
<xml_diff>
--- a/02.LayeredArchitectures/Hometask.docx
+++ b/02.LayeredArchitectures/Hometask.docx
@@ -1031,49 +1031,7 @@
         <w:rPr>
           <w:rFonts w:ascii="Verdana" w:hAnsi="Verdana"/>
         </w:rPr>
-        <w:t xml:space="preserve">Is the below layered architecture correct and why? Is it possible </w:t>
-      </w:r>
-      <w:proofErr w:type="gramStart"/>
-      <w:r>
-        <w:rPr>
-          <w:rFonts w:ascii="Verdana" w:hAnsi="Verdana"/>
-        </w:rPr>
-        <w:t>from</w:t>
-      </w:r>
-      <w:proofErr w:type="gramEnd"/>
-      <w:r>
-        <w:rPr>
-          <w:rFonts w:ascii="Verdana" w:hAnsi="Verdana"/>
-        </w:rPr>
-        <w:t xml:space="preserve"> C to use B? </w:t>
-      </w:r>
-      <w:proofErr w:type="gramStart"/>
-      <w:r>
-        <w:rPr>
-          <w:rFonts w:ascii="Verdana" w:hAnsi="Verdana"/>
-        </w:rPr>
-        <w:t>from</w:t>
-      </w:r>
-      <w:proofErr w:type="gramEnd"/>
-      <w:r>
-        <w:rPr>
-          <w:rFonts w:ascii="Verdana" w:hAnsi="Verdana"/>
-        </w:rPr>
-        <w:t xml:space="preserve"> A </w:t>
-      </w:r>
-      <w:proofErr w:type="gramStart"/>
-      <w:r>
-        <w:rPr>
-          <w:rFonts w:ascii="Verdana" w:hAnsi="Verdana"/>
-        </w:rPr>
-        <w:t>to use</w:t>
-      </w:r>
-      <w:proofErr w:type="gramEnd"/>
-      <w:r>
-        <w:rPr>
-          <w:rFonts w:ascii="Verdana" w:hAnsi="Verdana"/>
-        </w:rPr>
-        <w:t xml:space="preserve"> C?</w:t>
+        <w:t>Is the below layered architecture correct and why? Is it possible from C to use B? from A to use C?</w:t>
       </w:r>
       <w:r>
         <w:t xml:space="preserve"> </w:t>
@@ -1366,19 +1324,7 @@
         <w:rPr>
           <w:rFonts w:ascii="Verdana" w:hAnsi="Verdana"/>
         </w:rPr>
-        <w:t xml:space="preserve"> </w:t>
-      </w:r>
-      <w:r>
-        <w:rPr>
-          <w:rFonts w:ascii="Verdana" w:hAnsi="Verdana"/>
-        </w:rPr>
-        <w:t>Architecture</w:t>
-      </w:r>
-      <w:r>
-        <w:rPr>
-          <w:rFonts w:ascii="Verdana" w:hAnsi="Verdana"/>
-        </w:rPr>
-        <w:t xml:space="preserve"> use Dependency Inversion Principle</w:t>
+        <w:t xml:space="preserve"> Architecture use Dependency Inversion Principle</w:t>
       </w:r>
       <w:r>
         <w:rPr>
@@ -1420,19 +1366,7 @@
         <w:rPr>
           <w:rFonts w:ascii="Verdana" w:hAnsi="Verdana"/>
         </w:rPr>
-        <w:t xml:space="preserve"> of initial </w:t>
-      </w:r>
-      <w:r>
-        <w:rPr>
-          <w:rFonts w:ascii="Verdana" w:hAnsi="Verdana"/>
-        </w:rPr>
-        <w:t>N-tier</w:t>
-      </w:r>
-      <w:r>
-        <w:rPr>
-          <w:rFonts w:ascii="Verdana" w:hAnsi="Verdana"/>
-        </w:rPr>
-        <w:t xml:space="preserve"> architecture.</w:t>
+        <w:t xml:space="preserve"> of initial N-tier architecture.</w:t>
       </w:r>
     </w:p>
     <w:p>
@@ -1450,21 +1384,7 @@
         <w:rPr>
           <w:rFonts w:ascii="Verdana" w:hAnsi="Verdana"/>
         </w:rPr>
-        <w:t xml:space="preserve">Is the below layered architecture correct and why? Is it possible </w:t>
-      </w:r>
-      <w:proofErr w:type="gramStart"/>
-      <w:r>
-        <w:rPr>
-          <w:rFonts w:ascii="Verdana" w:hAnsi="Verdana"/>
-        </w:rPr>
-        <w:t>from</w:t>
-      </w:r>
-      <w:proofErr w:type="gramEnd"/>
-      <w:r>
-        <w:rPr>
-          <w:rFonts w:ascii="Verdana" w:hAnsi="Verdana"/>
-        </w:rPr>
-        <w:t xml:space="preserve"> C to use B? from A to use C?</w:t>
+        <w:t>Is the below layered architecture correct and why? Is it possible from C to use B? from A to use C?</w:t>
       </w:r>
     </w:p>
     <w:p>
@@ -1573,29 +1493,641 @@
     </w:p>
     <w:p>
       <w:pPr>
-        <w:rPr>
-          <w:rFonts w:ascii="Verdana" w:hAnsi="Verdana"/>
-        </w:rPr>
-      </w:pPr>
+        <w:pStyle w:val="ListParagraph"/>
+        <w:rPr>
+          <w:rFonts w:ascii="Verdana" w:hAnsi="Verdana"/>
+        </w:rPr>
+      </w:pPr>
+      <w:r>
+        <w:rPr>
+          <w:rFonts w:ascii="Verdana" w:hAnsi="Verdana"/>
+        </w:rPr>
+        <w:t>Yes,</w:t>
+      </w:r>
+      <w:r>
+        <w:rPr>
+          <w:rFonts w:ascii="Verdana" w:hAnsi="Verdana"/>
+        </w:rPr>
+        <w:t xml:space="preserve"> we can </w:t>
+      </w:r>
+      <w:r>
+        <w:rPr>
+          <w:rFonts w:ascii="Verdana" w:hAnsi="Verdana"/>
+        </w:rPr>
+        <w:t>consider</w:t>
+      </w:r>
+      <w:r>
+        <w:rPr>
+          <w:rFonts w:ascii="Verdana" w:hAnsi="Verdana"/>
+        </w:rPr>
+        <w:t xml:space="preserve"> DDD as </w:t>
+      </w:r>
+      <w:r>
+        <w:rPr>
+          <w:rFonts w:ascii="Verdana" w:hAnsi="Verdana"/>
+        </w:rPr>
+        <w:t>one common</w:t>
+      </w:r>
+      <w:r>
+        <w:rPr>
+          <w:rFonts w:ascii="Verdana" w:hAnsi="Verdana"/>
+        </w:rPr>
+        <w:t xml:space="preserve"> way to implement </w:t>
+      </w:r>
+      <w:r>
+        <w:rPr>
+          <w:rFonts w:ascii="Verdana" w:hAnsi="Verdana"/>
+        </w:rPr>
+        <w:t>layered architecture</w:t>
+      </w:r>
+      <w:r>
+        <w:rPr>
+          <w:rFonts w:ascii="Verdana" w:hAnsi="Verdana"/>
+        </w:rPr>
+        <w:t>, but it’s not primarily an architecture pattern</w:t>
+      </w:r>
+      <w:r>
+        <w:rPr>
+          <w:rFonts w:ascii="Verdana" w:hAnsi="Verdana"/>
+        </w:rPr>
+        <w:t>.</w:t>
+      </w:r>
+      <w:r>
+        <w:rPr>
+          <w:rFonts w:ascii="Verdana" w:hAnsi="Verdana"/>
+        </w:rPr>
+        <w:t xml:space="preserve"> Anemic model</w:t>
+      </w:r>
+      <w:r>
+        <w:rPr>
+          <w:rFonts w:ascii="Verdana" w:hAnsi="Verdana"/>
+        </w:rPr>
+        <w:t xml:space="preserve"> is</w:t>
+      </w:r>
+      <w:r>
+        <w:rPr>
+          <w:rFonts w:ascii="Verdana" w:hAnsi="Verdana"/>
+        </w:rPr>
+        <w:t xml:space="preserve"> </w:t>
+      </w:r>
+      <w:r>
+        <w:rPr>
+          <w:rFonts w:ascii="Verdana" w:hAnsi="Verdana"/>
+        </w:rPr>
+        <w:t>a</w:t>
+      </w:r>
+      <w:r>
+        <w:rPr>
+          <w:rFonts w:ascii="Verdana" w:hAnsi="Verdana"/>
+        </w:rPr>
+        <w:t xml:space="preserve"> domain model where the entities/objects have only data (fields/properties) but no business behavior — all business logic is moved to separate service classes</w:t>
+      </w:r>
+      <w:r>
+        <w:rPr>
+          <w:rFonts w:ascii="Verdana" w:hAnsi="Verdana"/>
+        </w:rPr>
+        <w:t>.</w:t>
+      </w:r>
+      <w:r>
+        <w:rPr>
+          <w:rFonts w:ascii="Verdana" w:hAnsi="Verdana"/>
+        </w:rPr>
+        <w:t xml:space="preserve"> </w:t>
+      </w:r>
+      <w:r>
+        <w:rPr>
+          <w:rFonts w:ascii="Verdana" w:hAnsi="Verdana"/>
+        </w:rPr>
+        <w:t>T</w:t>
+      </w:r>
+      <w:r>
+        <w:rPr>
+          <w:rFonts w:ascii="Verdana" w:hAnsi="Verdana"/>
+        </w:rPr>
+        <w:t xml:space="preserve">here are cases where it’s preferable: </w:t>
+      </w:r>
+      <w:r>
+        <w:rPr>
+          <w:rFonts w:ascii="Verdana" w:hAnsi="Verdana"/>
+        </w:rPr>
+        <w:t>such as simple CRUD systems or when doing quick iterations in the early stages of product development</w:t>
+      </w:r>
+      <w:r>
+        <w:rPr>
+          <w:rFonts w:ascii="Verdana" w:hAnsi="Verdana"/>
+        </w:rPr>
+        <w:t>.</w:t>
+      </w:r>
     </w:p>
     <w:p>
       <w:pPr>
-        <w:rPr>
-          <w:rFonts w:ascii="Verdana" w:hAnsi="Verdana"/>
-        </w:rPr>
-      </w:pPr>
+        <w:pStyle w:val="ListParagraph"/>
+        <w:numPr>
+          <w:ilvl w:val="0"/>
+          <w:numId w:val="66"/>
+        </w:numPr>
+        <w:rPr>
+          <w:rFonts w:ascii="Verdana" w:hAnsi="Verdana"/>
+        </w:rPr>
+      </w:pPr>
+      <w:r>
+        <w:rPr>
+          <w:rFonts w:ascii="Verdana" w:hAnsi="Verdana"/>
+        </w:rPr>
+        <w:t>What are architectural anti-patterns? Discuss at least three, think of any on your current or previous projects.</w:t>
+      </w:r>
     </w:p>
     <w:p>
       <w:pPr>
-        <w:rPr>
-          <w:rFonts w:ascii="Verdana" w:hAnsi="Verdana"/>
-        </w:rPr>
-      </w:pPr>
+        <w:pStyle w:val="ListParagraph"/>
+        <w:rPr>
+          <w:rFonts w:ascii="Verdana" w:hAnsi="Verdana"/>
+        </w:rPr>
+      </w:pPr>
+      <w:r>
+        <w:rPr>
+          <w:rFonts w:ascii="Verdana" w:hAnsi="Verdana"/>
+        </w:rPr>
+        <w:t xml:space="preserve">An anti-pattern is just like a pattern, except that instead of a solution it gives something that looks superficially like a </w:t>
+      </w:r>
+      <w:r>
+        <w:rPr>
+          <w:rFonts w:ascii="Verdana" w:hAnsi="Verdana"/>
+        </w:rPr>
+        <w:t>solution but</w:t>
+      </w:r>
+      <w:r>
+        <w:rPr>
+          <w:rFonts w:ascii="Verdana" w:hAnsi="Verdana"/>
+        </w:rPr>
+        <w:t xml:space="preserve"> isn’t one.</w:t>
+      </w:r>
+      <w:r>
+        <w:rPr>
+          <w:rFonts w:ascii="Verdana" w:hAnsi="Verdana"/>
+        </w:rPr>
+        <w:t xml:space="preserve"> The </w:t>
+      </w:r>
+      <w:r>
+        <w:rPr>
+          <w:rFonts w:ascii="Verdana" w:hAnsi="Verdana"/>
+        </w:rPr>
+        <w:t>four</w:t>
+      </w:r>
+      <w:r>
+        <w:rPr>
+          <w:rFonts w:ascii="Verdana" w:hAnsi="Verdana"/>
+        </w:rPr>
+        <w:t xml:space="preserve"> most encountered</w:t>
+      </w:r>
+      <w:r>
+        <w:rPr>
+          <w:rFonts w:ascii="Verdana" w:hAnsi="Verdana"/>
+        </w:rPr>
+        <w:t xml:space="preserve"> </w:t>
+      </w:r>
+      <w:r>
+        <w:rPr>
+          <w:rFonts w:ascii="Verdana" w:hAnsi="Verdana"/>
+        </w:rPr>
+        <w:t>anti-pattern</w:t>
+      </w:r>
+      <w:r>
+        <w:rPr>
+          <w:rFonts w:ascii="Verdana" w:hAnsi="Verdana"/>
+        </w:rPr>
+        <w:t>s</w:t>
+      </w:r>
+      <w:r>
+        <w:rPr>
+          <w:rFonts w:ascii="Verdana" w:hAnsi="Verdana"/>
+        </w:rPr>
+        <w:t xml:space="preserve"> in my practice</w:t>
+      </w:r>
+      <w:r>
+        <w:rPr>
+          <w:rFonts w:ascii="Verdana" w:hAnsi="Verdana"/>
+        </w:rPr>
+        <w:t xml:space="preserve"> at EPAM</w:t>
+      </w:r>
+      <w:r>
+        <w:rPr>
+          <w:rFonts w:ascii="Verdana" w:hAnsi="Verdana"/>
+        </w:rPr>
+        <w:t xml:space="preserve"> are:</w:t>
+      </w:r>
+      <w:r>
+        <w:t xml:space="preserve"> </w:t>
+      </w:r>
+      <w:r>
+        <w:rPr>
+          <w:rFonts w:ascii="Verdana" w:hAnsi="Verdana"/>
+        </w:rPr>
+        <w:t>Error Hiding</w:t>
+      </w:r>
+      <w:r>
+        <w:rPr>
+          <w:rFonts w:ascii="Verdana" w:hAnsi="Verdana"/>
+        </w:rPr>
+        <w:t xml:space="preserve">, </w:t>
+      </w:r>
+      <w:r>
+        <w:rPr>
+          <w:rFonts w:ascii="Verdana" w:hAnsi="Verdana"/>
+        </w:rPr>
+        <w:t>Spaghetti Code</w:t>
+      </w:r>
+      <w:r>
+        <w:rPr>
+          <w:rFonts w:ascii="Verdana" w:hAnsi="Verdana"/>
+        </w:rPr>
+        <w:t xml:space="preserve">, </w:t>
+      </w:r>
+      <w:r>
+        <w:rPr>
+          <w:rFonts w:ascii="Verdana" w:hAnsi="Verdana"/>
+        </w:rPr>
+        <w:t>Copy-Paste Programming</w:t>
+      </w:r>
+      <w:r>
+        <w:rPr>
+          <w:rFonts w:ascii="Verdana" w:hAnsi="Verdana"/>
+        </w:rPr>
+        <w:t xml:space="preserve"> and </w:t>
+      </w:r>
+      <w:r>
+        <w:rPr>
+          <w:rFonts w:ascii="Verdana" w:hAnsi="Verdana"/>
+        </w:rPr>
+        <w:t>Golden Hammer</w:t>
+      </w:r>
+      <w:r>
+        <w:rPr>
+          <w:rFonts w:ascii="Verdana" w:hAnsi="Verdana"/>
+        </w:rPr>
+        <w:t>.</w:t>
+      </w:r>
     </w:p>
     <w:p>
       <w:pPr>
-        <w:jc w:val="both"/>
-      </w:pPr>
+        <w:pStyle w:val="ListParagraph"/>
+        <w:numPr>
+          <w:ilvl w:val="0"/>
+          <w:numId w:val="71"/>
+        </w:numPr>
+        <w:rPr>
+          <w:rFonts w:ascii="Verdana" w:hAnsi="Verdana"/>
+        </w:rPr>
+      </w:pPr>
+      <w:r>
+        <w:rPr>
+          <w:rFonts w:ascii="Verdana" w:hAnsi="Verdana"/>
+        </w:rPr>
+        <w:lastRenderedPageBreak/>
+        <w:t xml:space="preserve">Error Hiding – </w:t>
+      </w:r>
+      <w:r>
+        <w:rPr>
+          <w:rFonts w:ascii="Verdana" w:hAnsi="Verdana"/>
+        </w:rPr>
+        <w:t>s</w:t>
+      </w:r>
+      <w:r>
+        <w:rPr>
+          <w:rFonts w:ascii="Verdana" w:hAnsi="Verdana"/>
+        </w:rPr>
+        <w:t>uppressing or ignoring error messages/exceptions instead of handling them correctly.</w:t>
+      </w:r>
+    </w:p>
+    <w:p>
+      <w:pPr>
+        <w:pStyle w:val="ListParagraph"/>
+        <w:numPr>
+          <w:ilvl w:val="0"/>
+          <w:numId w:val="71"/>
+        </w:numPr>
+        <w:rPr>
+          <w:rFonts w:ascii="Verdana" w:hAnsi="Verdana"/>
+        </w:rPr>
+      </w:pPr>
+      <w:r>
+        <w:rPr>
+          <w:rFonts w:ascii="Verdana" w:hAnsi="Verdana"/>
+        </w:rPr>
+        <w:t xml:space="preserve">Spaghetti Code – </w:t>
+      </w:r>
+      <w:r>
+        <w:rPr>
+          <w:rFonts w:ascii="Verdana" w:hAnsi="Verdana"/>
+        </w:rPr>
+        <w:t>c</w:t>
+      </w:r>
+      <w:r>
+        <w:rPr>
+          <w:rFonts w:ascii="Verdana" w:hAnsi="Verdana"/>
+        </w:rPr>
+        <w:t>ode with a tangled structure and no clear separation of concerns, making it hard to follow and maintain</w:t>
+      </w:r>
+      <w:r>
+        <w:rPr>
+          <w:rFonts w:ascii="Verdana" w:hAnsi="Verdana"/>
+        </w:rPr>
+        <w:t>.</w:t>
+      </w:r>
+    </w:p>
+    <w:p>
+      <w:pPr>
+        <w:pStyle w:val="ListParagraph"/>
+        <w:numPr>
+          <w:ilvl w:val="0"/>
+          <w:numId w:val="71"/>
+        </w:numPr>
+        <w:rPr>
+          <w:rFonts w:ascii="Verdana" w:hAnsi="Verdana"/>
+        </w:rPr>
+      </w:pPr>
+      <w:r>
+        <w:rPr>
+          <w:rFonts w:ascii="Verdana" w:hAnsi="Verdana"/>
+        </w:rPr>
+        <w:t>Copy</w:t>
+      </w:r>
+      <w:r>
+        <w:rPr>
+          <w:rFonts w:ascii="Cambria Math" w:hAnsi="Cambria Math" w:cs="Cambria Math"/>
+        </w:rPr>
+        <w:t>‑</w:t>
+      </w:r>
+      <w:r>
+        <w:rPr>
+          <w:rFonts w:ascii="Verdana" w:hAnsi="Verdana"/>
+        </w:rPr>
+        <w:t xml:space="preserve">Paste Programming </w:t>
+      </w:r>
+      <w:r>
+        <w:rPr>
+          <w:rFonts w:ascii="Verdana" w:hAnsi="Verdana" w:cs="Verdana"/>
+        </w:rPr>
+        <w:t>–</w:t>
+      </w:r>
+      <w:r>
+        <w:rPr>
+          <w:rFonts w:ascii="Verdana" w:hAnsi="Verdana"/>
+        </w:rPr>
+        <w:t xml:space="preserve"> </w:t>
+      </w:r>
+      <w:r>
+        <w:rPr>
+          <w:rFonts w:ascii="Verdana" w:hAnsi="Verdana"/>
+        </w:rPr>
+        <w:t>d</w:t>
+      </w:r>
+      <w:r>
+        <w:rPr>
+          <w:rFonts w:ascii="Verdana" w:hAnsi="Verdana"/>
+        </w:rPr>
+        <w:t>uplicating blocks of code instead of refactoring and reusing functionality.</w:t>
+      </w:r>
+    </w:p>
+    <w:p>
+      <w:pPr>
+        <w:pStyle w:val="ListParagraph"/>
+        <w:numPr>
+          <w:ilvl w:val="0"/>
+          <w:numId w:val="71"/>
+        </w:numPr>
+        <w:rPr>
+          <w:rFonts w:ascii="Verdana" w:hAnsi="Verdana"/>
+        </w:rPr>
+      </w:pPr>
+      <w:r>
+        <w:rPr>
+          <w:rFonts w:ascii="Verdana" w:hAnsi="Verdana"/>
+        </w:rPr>
+        <w:t xml:space="preserve">Golden Hammer – </w:t>
+      </w:r>
+      <w:r>
+        <w:rPr>
+          <w:rFonts w:ascii="Verdana" w:hAnsi="Verdana"/>
+        </w:rPr>
+        <w:t>o</w:t>
+      </w:r>
+      <w:r>
+        <w:rPr>
+          <w:rFonts w:ascii="Verdana" w:hAnsi="Verdana"/>
+        </w:rPr>
+        <w:t>verusing a favorite technology/tool/library for all problems, even when it’s not a good fit.</w:t>
+      </w:r>
+    </w:p>
+    <w:p>
+      <w:pPr>
+        <w:numPr>
+          <w:ilvl w:val="0"/>
+          <w:numId w:val="66"/>
+        </w:numPr>
+        <w:rPr>
+          <w:rFonts w:ascii="Verdana" w:hAnsi="Verdana"/>
+        </w:rPr>
+      </w:pPr>
+      <w:r>
+        <w:rPr>
+          <w:rFonts w:ascii="Verdana" w:hAnsi="Verdana"/>
+        </w:rPr>
+        <w:t>What do Testability, Extensibility and Scalability NFRs mean. How would you ensure you reached them? Does Clean Architecture cover these NFRs?</w:t>
+      </w:r>
+    </w:p>
+    <w:p>
+      <w:pPr>
+        <w:pStyle w:val="ListParagraph"/>
+        <w:numPr>
+          <w:ilvl w:val="0"/>
+          <w:numId w:val="70"/>
+        </w:numPr>
+        <w:rPr>
+          <w:rFonts w:ascii="Verdana" w:hAnsi="Verdana"/>
+        </w:rPr>
+      </w:pPr>
+      <w:r>
+        <w:rPr>
+          <w:rFonts w:ascii="Verdana" w:hAnsi="Verdana"/>
+        </w:rPr>
+        <w:t>Testability - the degree to which the system’s components can be isolated and tested (unit, integration, etc.) with minimal effort and dependencies.</w:t>
+      </w:r>
+      <w:r>
+        <w:rPr>
+          <w:rFonts w:ascii="Verdana" w:hAnsi="Verdana"/>
+        </w:rPr>
+        <w:t xml:space="preserve"> Higher testability </w:t>
+      </w:r>
+      <w:r>
+        <w:rPr>
+          <w:rFonts w:ascii="Arial" w:hAnsi="Arial" w:cs="Arial"/>
+        </w:rPr>
+        <w:t>→</w:t>
+      </w:r>
+      <w:r>
+        <w:rPr>
+          <w:rFonts w:ascii="Verdana" w:hAnsi="Verdana"/>
+        </w:rPr>
+        <w:t xml:space="preserve"> easier bug detection, faster development cycles, lower maintenance costs.</w:t>
+      </w:r>
+    </w:p>
+    <w:p>
+      <w:pPr>
+        <w:numPr>
+          <w:ilvl w:val="0"/>
+          <w:numId w:val="69"/>
+        </w:numPr>
+        <w:rPr>
+          <w:rFonts w:ascii="Verdana" w:hAnsi="Verdana"/>
+        </w:rPr>
+      </w:pPr>
+      <w:r>
+        <w:rPr>
+          <w:rFonts w:ascii="Verdana" w:hAnsi="Verdana"/>
+        </w:rPr>
+        <w:t>Extensibility - designing the system so that you can extend its capabilities without major restructuring.</w:t>
+      </w:r>
+      <w:r>
+        <w:rPr>
+          <w:rFonts w:ascii="Verdana" w:hAnsi="Verdana"/>
+        </w:rPr>
+        <w:t xml:space="preserve"> Supports evolving business needs and changing environment over time.</w:t>
+      </w:r>
+      <w:r>
+        <w:rPr>
+          <w:rFonts w:ascii="Verdana" w:hAnsi="Verdana"/>
+        </w:rPr>
+        <w:t xml:space="preserve"> It is closely related to maintainability.</w:t>
+      </w:r>
+    </w:p>
+    <w:p>
+      <w:pPr>
+        <w:numPr>
+          <w:ilvl w:val="0"/>
+          <w:numId w:val="69"/>
+        </w:numPr>
+        <w:rPr>
+          <w:rFonts w:ascii="Verdana" w:hAnsi="Verdana"/>
+        </w:rPr>
+      </w:pPr>
+      <w:r>
+        <w:rPr>
+          <w:rFonts w:ascii="Verdana" w:hAnsi="Verdana"/>
+        </w:rPr>
+        <w:t>Scalability</w:t>
+      </w:r>
+      <w:r>
+        <w:rPr>
+          <w:rFonts w:ascii="Verdana" w:hAnsi="Verdana"/>
+        </w:rPr>
+        <w:t xml:space="preserve"> </w:t>
+      </w:r>
+      <w:r>
+        <w:rPr>
+          <w:rFonts w:ascii="Verdana" w:hAnsi="Verdana"/>
+        </w:rPr>
+        <w:t>- a</w:t>
+      </w:r>
+      <w:r>
+        <w:rPr>
+          <w:rFonts w:ascii="Verdana" w:hAnsi="Verdana"/>
+        </w:rPr>
+        <w:t>bility to grow in capacity or performance without degradation in service.</w:t>
+      </w:r>
+      <w:r>
+        <w:rPr>
+          <w:rFonts w:ascii="Verdana" w:hAnsi="Verdana"/>
+        </w:rPr>
+        <w:t xml:space="preserve"> </w:t>
+      </w:r>
+      <w:r>
+        <w:rPr>
+          <w:rFonts w:ascii="Verdana" w:hAnsi="Verdana"/>
+        </w:rPr>
+        <w:t>Ensure</w:t>
+      </w:r>
+      <w:r>
+        <w:rPr>
+          <w:rFonts w:ascii="Verdana" w:hAnsi="Verdana"/>
+        </w:rPr>
+        <w:t xml:space="preserve"> the system remains responsive as demand grows.</w:t>
+      </w:r>
+    </w:p>
+    <w:p>
+      <w:pPr>
+        <w:ind w:left="720"/>
+        <w:rPr>
+          <w:rFonts w:ascii="Verdana" w:hAnsi="Verdana"/>
+        </w:rPr>
+      </w:pPr>
+      <w:r>
+        <w:rPr>
+          <w:rFonts w:ascii="Verdana" w:hAnsi="Verdana"/>
+        </w:rPr>
+        <w:t>Testability: Clean Architecture strongly supports testability by enforcing Separation of Concerns and the Dependency Inversion Principle. The Domain and Application layers are isolated from UI and infrastructure, so they can be tested without external dependencies. Interfaces and dependency injection allow mocking of external services or the database in tests.</w:t>
+      </w:r>
+    </w:p>
+    <w:p>
+      <w:pPr>
+        <w:ind w:left="720"/>
+        <w:rPr>
+          <w:rFonts w:ascii="Verdana" w:hAnsi="Verdana"/>
+        </w:rPr>
+      </w:pPr>
+      <w:r>
+        <w:rPr>
+          <w:rFonts w:ascii="Verdana" w:hAnsi="Verdana"/>
+        </w:rPr>
+        <w:t>Extensibility: Clean Architecture promotes extensibility via its strict dependency rule: the core logic has no dependencies on frameworks, databases, or other infrastructure. Contracts are defined as interfaces in the Core, and implementations can be added or replaced in outer layers without modifying the core. This modular design and adherence to SOLID principles (especially Open/Closed) make adding new features easier with minimal impact.</w:t>
+      </w:r>
+    </w:p>
+    <w:p>
+      <w:pPr>
+        <w:ind w:left="720"/>
+        <w:rPr>
+          <w:rFonts w:ascii="Verdana" w:hAnsi="Verdana"/>
+        </w:rPr>
+      </w:pPr>
+      <w:r>
+        <w:rPr>
+          <w:rFonts w:ascii="Verdana" w:hAnsi="Verdana"/>
+        </w:rPr>
+        <w:lastRenderedPageBreak/>
+        <w:t xml:space="preserve">Scalability: </w:t>
+      </w:r>
+      <w:r>
+        <w:rPr>
+          <w:rFonts w:ascii="Verdana" w:hAnsi="Verdana"/>
+        </w:rPr>
+        <w:t xml:space="preserve">Clean Architecture is </w:t>
+      </w:r>
+      <w:r>
+        <w:rPr>
+          <w:rFonts w:ascii="Verdana" w:hAnsi="Verdana"/>
+        </w:rPr>
+        <w:t>scale neutral</w:t>
+      </w:r>
+      <w:r>
+        <w:rPr>
+          <w:rFonts w:ascii="Verdana" w:hAnsi="Verdana"/>
+        </w:rPr>
+        <w:t>. It won’t hinder scaling, because layers are decoupled, making service extraction or distribution easier. But scaling is achieved by applying additional architectural patterns in deployment.</w:t>
+      </w:r>
+    </w:p>
+    <w:p>
+      <w:pPr>
+        <w:ind w:left="720"/>
+        <w:rPr>
+          <w:rFonts w:ascii="Verdana" w:hAnsi="Verdana"/>
+        </w:rPr>
+      </w:pPr>
+      <w:r>
+        <w:rPr>
+          <w:rFonts w:ascii="Verdana" w:hAnsi="Verdana"/>
+        </w:rPr>
+        <w:t>Conclusion: Clean Architecture natively addresses Testability and Extensibility through its structure and principles. Scalability is not its primary concern, but its modular design makes integration with scalable solutions easier.</w:t>
+      </w:r>
     </w:p>
     <w:sectPr>
       <w:pgSz w:w="12240" w:h="15840"/>
@@ -1872,6 +2404,155 @@
     </w:lvl>
   </w:abstractNum>
   <w:abstractNum w:abstractNumId="2" w15:restartNumberingAfterBreak="0">
+    <w:nsid w:val="06C6150E"/>
+    <w:multiLevelType w:val="multilevel"/>
+    <w:tmpl w:val="E86E5582"/>
+    <w:lvl w:ilvl="0">
+      <w:start w:val="1"/>
+      <w:numFmt w:val="bullet"/>
+      <w:lvlText w:val=""/>
+      <w:lvlJc w:val="left"/>
+      <w:pPr>
+        <w:tabs>
+          <w:tab w:val="num" w:pos="1080"/>
+        </w:tabs>
+        <w:ind w:left="1080" w:hanging="360"/>
+      </w:pPr>
+      <w:rPr>
+        <w:rFonts w:ascii="Symbol" w:hAnsi="Symbol" w:hint="default"/>
+        <w:sz w:val="20"/>
+      </w:rPr>
+    </w:lvl>
+    <w:lvl w:ilvl="1">
+      <w:start w:val="1"/>
+      <w:numFmt w:val="bullet"/>
+      <w:lvlText w:val=""/>
+      <w:lvlJc w:val="left"/>
+      <w:pPr>
+        <w:tabs>
+          <w:tab w:val="num" w:pos="1800"/>
+        </w:tabs>
+        <w:ind w:left="1800" w:hanging="360"/>
+      </w:pPr>
+      <w:rPr>
+        <w:rFonts w:ascii="Symbol" w:hAnsi="Symbol" w:hint="default"/>
+        <w:sz w:val="20"/>
+      </w:rPr>
+    </w:lvl>
+    <w:lvl w:ilvl="2" w:tentative="1">
+      <w:start w:val="1"/>
+      <w:numFmt w:val="bullet"/>
+      <w:lvlText w:val=""/>
+      <w:lvlJc w:val="left"/>
+      <w:pPr>
+        <w:tabs>
+          <w:tab w:val="num" w:pos="2520"/>
+        </w:tabs>
+        <w:ind w:left="2520" w:hanging="360"/>
+      </w:pPr>
+      <w:rPr>
+        <w:rFonts w:ascii="Symbol" w:hAnsi="Symbol" w:hint="default"/>
+        <w:sz w:val="20"/>
+      </w:rPr>
+    </w:lvl>
+    <w:lvl w:ilvl="3" w:tentative="1">
+      <w:start w:val="1"/>
+      <w:numFmt w:val="bullet"/>
+      <w:lvlText w:val=""/>
+      <w:lvlJc w:val="left"/>
+      <w:pPr>
+        <w:tabs>
+          <w:tab w:val="num" w:pos="3240"/>
+        </w:tabs>
+        <w:ind w:left="3240" w:hanging="360"/>
+      </w:pPr>
+      <w:rPr>
+        <w:rFonts w:ascii="Symbol" w:hAnsi="Symbol" w:hint="default"/>
+        <w:sz w:val="20"/>
+      </w:rPr>
+    </w:lvl>
+    <w:lvl w:ilvl="4" w:tentative="1">
+      <w:start w:val="1"/>
+      <w:numFmt w:val="bullet"/>
+      <w:lvlText w:val=""/>
+      <w:lvlJc w:val="left"/>
+      <w:pPr>
+        <w:tabs>
+          <w:tab w:val="num" w:pos="3960"/>
+        </w:tabs>
+        <w:ind w:left="3960" w:hanging="360"/>
+      </w:pPr>
+      <w:rPr>
+        <w:rFonts w:ascii="Symbol" w:hAnsi="Symbol" w:hint="default"/>
+        <w:sz w:val="20"/>
+      </w:rPr>
+    </w:lvl>
+    <w:lvl w:ilvl="5" w:tentative="1">
+      <w:start w:val="1"/>
+      <w:numFmt w:val="bullet"/>
+      <w:lvlText w:val=""/>
+      <w:lvlJc w:val="left"/>
+      <w:pPr>
+        <w:tabs>
+          <w:tab w:val="num" w:pos="4680"/>
+        </w:tabs>
+        <w:ind w:left="4680" w:hanging="360"/>
+      </w:pPr>
+      <w:rPr>
+        <w:rFonts w:ascii="Symbol" w:hAnsi="Symbol" w:hint="default"/>
+        <w:sz w:val="20"/>
+      </w:rPr>
+    </w:lvl>
+    <w:lvl w:ilvl="6" w:tentative="1">
+      <w:start w:val="1"/>
+      <w:numFmt w:val="bullet"/>
+      <w:lvlText w:val=""/>
+      <w:lvlJc w:val="left"/>
+      <w:pPr>
+        <w:tabs>
+          <w:tab w:val="num" w:pos="5400"/>
+        </w:tabs>
+        <w:ind w:left="5400" w:hanging="360"/>
+      </w:pPr>
+      <w:rPr>
+        <w:rFonts w:ascii="Symbol" w:hAnsi="Symbol" w:hint="default"/>
+        <w:sz w:val="20"/>
+      </w:rPr>
+    </w:lvl>
+    <w:lvl w:ilvl="7" w:tentative="1">
+      <w:start w:val="1"/>
+      <w:numFmt w:val="bullet"/>
+      <w:lvlText w:val=""/>
+      <w:lvlJc w:val="left"/>
+      <w:pPr>
+        <w:tabs>
+          <w:tab w:val="num" w:pos="6120"/>
+        </w:tabs>
+        <w:ind w:left="6120" w:hanging="360"/>
+      </w:pPr>
+      <w:rPr>
+        <w:rFonts w:ascii="Symbol" w:hAnsi="Symbol" w:hint="default"/>
+        <w:sz w:val="20"/>
+      </w:rPr>
+    </w:lvl>
+    <w:lvl w:ilvl="8" w:tentative="1">
+      <w:start w:val="1"/>
+      <w:numFmt w:val="bullet"/>
+      <w:lvlText w:val=""/>
+      <w:lvlJc w:val="left"/>
+      <w:pPr>
+        <w:tabs>
+          <w:tab w:val="num" w:pos="6840"/>
+        </w:tabs>
+        <w:ind w:left="6840" w:hanging="360"/>
+      </w:pPr>
+      <w:rPr>
+        <w:rFonts w:ascii="Symbol" w:hAnsi="Symbol" w:hint="default"/>
+        <w:sz w:val="20"/>
+      </w:rPr>
+    </w:lvl>
+  </w:abstractNum>
+  <w:abstractNum w:abstractNumId="3" w15:restartNumberingAfterBreak="0">
     <w:nsid w:val="07416926"/>
     <w:multiLevelType w:val="multilevel"/>
     <w:tmpl w:val="341EDCA0"/>
@@ -2020,7 +2701,7 @@
       </w:rPr>
     </w:lvl>
   </w:abstractNum>
-  <w:abstractNum w:abstractNumId="3" w15:restartNumberingAfterBreak="0">
+  <w:abstractNum w:abstractNumId="4" w15:restartNumberingAfterBreak="0">
     <w:nsid w:val="07796844"/>
     <w:multiLevelType w:val="hybridMultilevel"/>
     <w:tmpl w:val="7944A8D8"/>
@@ -2133,7 +2814,7 @@
       </w:rPr>
     </w:lvl>
   </w:abstractNum>
-  <w:abstractNum w:abstractNumId="4" w15:restartNumberingAfterBreak="0">
+  <w:abstractNum w:abstractNumId="5" w15:restartNumberingAfterBreak="0">
     <w:nsid w:val="0BC1220A"/>
     <w:multiLevelType w:val="multilevel"/>
     <w:tmpl w:val="495A97C4"/>
@@ -2246,7 +2927,7 @@
       </w:pPr>
     </w:lvl>
   </w:abstractNum>
-  <w:abstractNum w:abstractNumId="5" w15:restartNumberingAfterBreak="0">
+  <w:abstractNum w:abstractNumId="6" w15:restartNumberingAfterBreak="0">
     <w:nsid w:val="0E562F16"/>
     <w:multiLevelType w:val="multilevel"/>
     <w:tmpl w:val="A30A3478"/>
@@ -2396,7 +3077,7 @@
       </w:rPr>
     </w:lvl>
   </w:abstractNum>
-  <w:abstractNum w:abstractNumId="6" w15:restartNumberingAfterBreak="0">
+  <w:abstractNum w:abstractNumId="7" w15:restartNumberingAfterBreak="0">
     <w:nsid w:val="0EDC40FA"/>
     <w:multiLevelType w:val="multilevel"/>
     <w:tmpl w:val="EAB4C344"/>
@@ -2545,7 +3226,7 @@
       </w:rPr>
     </w:lvl>
   </w:abstractNum>
-  <w:abstractNum w:abstractNumId="7" w15:restartNumberingAfterBreak="0">
+  <w:abstractNum w:abstractNumId="8" w15:restartNumberingAfterBreak="0">
     <w:nsid w:val="0F9273EF"/>
     <w:multiLevelType w:val="multilevel"/>
     <w:tmpl w:val="AF6E85FA"/>
@@ -2694,7 +3375,7 @@
       </w:rPr>
     </w:lvl>
   </w:abstractNum>
-  <w:abstractNum w:abstractNumId="8" w15:restartNumberingAfterBreak="0">
+  <w:abstractNum w:abstractNumId="9" w15:restartNumberingAfterBreak="0">
     <w:nsid w:val="0FD1716C"/>
     <w:multiLevelType w:val="multilevel"/>
     <w:tmpl w:val="FB2C643A"/>
@@ -2843,7 +3524,7 @@
       </w:rPr>
     </w:lvl>
   </w:abstractNum>
-  <w:abstractNum w:abstractNumId="9" w15:restartNumberingAfterBreak="0">
+  <w:abstractNum w:abstractNumId="10" w15:restartNumberingAfterBreak="0">
     <w:nsid w:val="14216CD7"/>
     <w:multiLevelType w:val="multilevel"/>
     <w:tmpl w:val="94B209D0"/>
@@ -2992,7 +3673,7 @@
       </w:rPr>
     </w:lvl>
   </w:abstractNum>
-  <w:abstractNum w:abstractNumId="10" w15:restartNumberingAfterBreak="0">
+  <w:abstractNum w:abstractNumId="11" w15:restartNumberingAfterBreak="0">
     <w:nsid w:val="19742E2C"/>
     <w:multiLevelType w:val="multilevel"/>
     <w:tmpl w:val="AD5C1AB4"/>
@@ -3141,7 +3822,7 @@
       </w:rPr>
     </w:lvl>
   </w:abstractNum>
-  <w:abstractNum w:abstractNumId="11" w15:restartNumberingAfterBreak="0">
+  <w:abstractNum w:abstractNumId="12" w15:restartNumberingAfterBreak="0">
     <w:nsid w:val="1B1F17F4"/>
     <w:multiLevelType w:val="multilevel"/>
     <w:tmpl w:val="3CD89B86"/>
@@ -3254,7 +3935,7 @@
       </w:pPr>
     </w:lvl>
   </w:abstractNum>
-  <w:abstractNum w:abstractNumId="12" w15:restartNumberingAfterBreak="0">
+  <w:abstractNum w:abstractNumId="13" w15:restartNumberingAfterBreak="0">
     <w:nsid w:val="1BDD167D"/>
     <w:multiLevelType w:val="multilevel"/>
     <w:tmpl w:val="C1440316"/>
@@ -3367,7 +4048,7 @@
       </w:pPr>
     </w:lvl>
   </w:abstractNum>
-  <w:abstractNum w:abstractNumId="13" w15:restartNumberingAfterBreak="0">
+  <w:abstractNum w:abstractNumId="14" w15:restartNumberingAfterBreak="0">
     <w:nsid w:val="1E817029"/>
     <w:multiLevelType w:val="multilevel"/>
     <w:tmpl w:val="D22EEDD4"/>
@@ -3513,7 +4194,7 @@
       </w:rPr>
     </w:lvl>
   </w:abstractNum>
-  <w:abstractNum w:abstractNumId="14" w15:restartNumberingAfterBreak="0">
+  <w:abstractNum w:abstractNumId="15" w15:restartNumberingAfterBreak="0">
     <w:nsid w:val="21311202"/>
     <w:multiLevelType w:val="multilevel"/>
     <w:tmpl w:val="D22EEDD4"/>
@@ -3660,7 +4341,7 @@
       </w:rPr>
     </w:lvl>
   </w:abstractNum>
-  <w:abstractNum w:abstractNumId="15" w15:restartNumberingAfterBreak="0">
+  <w:abstractNum w:abstractNumId="16" w15:restartNumberingAfterBreak="0">
     <w:nsid w:val="23AE7231"/>
     <w:multiLevelType w:val="multilevel"/>
     <w:tmpl w:val="0AFCAE0C"/>
@@ -3809,7 +4490,7 @@
       </w:rPr>
     </w:lvl>
   </w:abstractNum>
-  <w:abstractNum w:abstractNumId="16" w15:restartNumberingAfterBreak="0">
+  <w:abstractNum w:abstractNumId="17" w15:restartNumberingAfterBreak="0">
     <w:nsid w:val="23E661FE"/>
     <w:multiLevelType w:val="multilevel"/>
     <w:tmpl w:val="AD5C1AB4"/>
@@ -3958,7 +4639,7 @@
       </w:rPr>
     </w:lvl>
   </w:abstractNum>
-  <w:abstractNum w:abstractNumId="17" w15:restartNumberingAfterBreak="0">
+  <w:abstractNum w:abstractNumId="18" w15:restartNumberingAfterBreak="0">
     <w:nsid w:val="24587DFD"/>
     <w:multiLevelType w:val="multilevel"/>
     <w:tmpl w:val="463AADD2"/>
@@ -4075,7 +4756,7 @@
       </w:pPr>
     </w:lvl>
   </w:abstractNum>
-  <w:abstractNum w:abstractNumId="18" w15:restartNumberingAfterBreak="0">
+  <w:abstractNum w:abstractNumId="19" w15:restartNumberingAfterBreak="0">
     <w:nsid w:val="25393FBD"/>
     <w:multiLevelType w:val="multilevel"/>
     <w:tmpl w:val="CA1299C6"/>
@@ -4224,7 +4905,7 @@
       </w:rPr>
     </w:lvl>
   </w:abstractNum>
-  <w:abstractNum w:abstractNumId="19" w15:restartNumberingAfterBreak="0">
+  <w:abstractNum w:abstractNumId="20" w15:restartNumberingAfterBreak="0">
     <w:nsid w:val="27F04E07"/>
     <w:multiLevelType w:val="multilevel"/>
     <w:tmpl w:val="55DADEB6"/>
@@ -4373,7 +5054,7 @@
       </w:rPr>
     </w:lvl>
   </w:abstractNum>
-  <w:abstractNum w:abstractNumId="20" w15:restartNumberingAfterBreak="0">
+  <w:abstractNum w:abstractNumId="21" w15:restartNumberingAfterBreak="0">
     <w:nsid w:val="291F334A"/>
     <w:multiLevelType w:val="multilevel"/>
     <w:tmpl w:val="BE0C5814"/>
@@ -4522,7 +5203,7 @@
       </w:rPr>
     </w:lvl>
   </w:abstractNum>
-  <w:abstractNum w:abstractNumId="21" w15:restartNumberingAfterBreak="0">
+  <w:abstractNum w:abstractNumId="22" w15:restartNumberingAfterBreak="0">
     <w:nsid w:val="2DCC35AC"/>
     <w:multiLevelType w:val="multilevel"/>
     <w:tmpl w:val="7EF2ABC8"/>
@@ -4671,7 +5352,7 @@
       </w:rPr>
     </w:lvl>
   </w:abstractNum>
-  <w:abstractNum w:abstractNumId="22" w15:restartNumberingAfterBreak="0">
+  <w:abstractNum w:abstractNumId="23" w15:restartNumberingAfterBreak="0">
     <w:nsid w:val="2DF55684"/>
     <w:multiLevelType w:val="multilevel"/>
     <w:tmpl w:val="ACF81840"/>
@@ -4820,7 +5501,7 @@
       </w:rPr>
     </w:lvl>
   </w:abstractNum>
-  <w:abstractNum w:abstractNumId="23" w15:restartNumberingAfterBreak="0">
+  <w:abstractNum w:abstractNumId="24" w15:restartNumberingAfterBreak="0">
     <w:nsid w:val="30BC5E80"/>
     <w:multiLevelType w:val="hybridMultilevel"/>
     <w:tmpl w:val="39169230"/>
@@ -4933,7 +5614,7 @@
       </w:rPr>
     </w:lvl>
   </w:abstractNum>
-  <w:abstractNum w:abstractNumId="24" w15:restartNumberingAfterBreak="0">
+  <w:abstractNum w:abstractNumId="25" w15:restartNumberingAfterBreak="0">
     <w:nsid w:val="31A4195A"/>
     <w:multiLevelType w:val="multilevel"/>
     <w:tmpl w:val="B4F21444"/>
@@ -5046,7 +5727,7 @@
       </w:pPr>
     </w:lvl>
   </w:abstractNum>
-  <w:abstractNum w:abstractNumId="25" w15:restartNumberingAfterBreak="0">
+  <w:abstractNum w:abstractNumId="26" w15:restartNumberingAfterBreak="0">
     <w:nsid w:val="3317402D"/>
     <w:multiLevelType w:val="multilevel"/>
     <w:tmpl w:val="9E662B54"/>
@@ -5195,7 +5876,7 @@
       </w:rPr>
     </w:lvl>
   </w:abstractNum>
-  <w:abstractNum w:abstractNumId="26" w15:restartNumberingAfterBreak="0">
+  <w:abstractNum w:abstractNumId="27" w15:restartNumberingAfterBreak="0">
     <w:nsid w:val="340B4B99"/>
     <w:multiLevelType w:val="multilevel"/>
     <w:tmpl w:val="F5B001F2"/>
@@ -5347,7 +6028,7 @@
       </w:rPr>
     </w:lvl>
   </w:abstractNum>
-  <w:abstractNum w:abstractNumId="27" w15:restartNumberingAfterBreak="0">
+  <w:abstractNum w:abstractNumId="28" w15:restartNumberingAfterBreak="0">
     <w:nsid w:val="39CE4591"/>
     <w:multiLevelType w:val="multilevel"/>
     <w:tmpl w:val="4B44D176"/>
@@ -5464,7 +6145,7 @@
       </w:pPr>
     </w:lvl>
   </w:abstractNum>
-  <w:abstractNum w:abstractNumId="28" w15:restartNumberingAfterBreak="0">
+  <w:abstractNum w:abstractNumId="29" w15:restartNumberingAfterBreak="0">
     <w:nsid w:val="3B642749"/>
     <w:multiLevelType w:val="multilevel"/>
     <w:tmpl w:val="D22EEDD4"/>
@@ -5611,7 +6292,7 @@
       </w:rPr>
     </w:lvl>
   </w:abstractNum>
-  <w:abstractNum w:abstractNumId="29" w15:restartNumberingAfterBreak="0">
+  <w:abstractNum w:abstractNumId="30" w15:restartNumberingAfterBreak="0">
     <w:nsid w:val="3BA03C61"/>
     <w:multiLevelType w:val="multilevel"/>
     <w:tmpl w:val="414082B6"/>
@@ -5760,7 +6441,93 @@
       </w:rPr>
     </w:lvl>
   </w:abstractNum>
-  <w:abstractNum w:abstractNumId="30" w15:restartNumberingAfterBreak="0">
+  <w:abstractNum w:abstractNumId="31" w15:restartNumberingAfterBreak="0">
+    <w:nsid w:val="3C611B5D"/>
+    <w:multiLevelType w:val="hybridMultilevel"/>
+    <w:tmpl w:val="F3D6EE46"/>
+    <w:lvl w:ilvl="0" w:tplc="0409000F">
+      <w:start w:val="1"/>
+      <w:numFmt w:val="decimal"/>
+      <w:lvlText w:val="%1."/>
+      <w:lvlJc w:val="left"/>
+      <w:pPr>
+        <w:ind w:left="360" w:hanging="360"/>
+      </w:pPr>
+    </w:lvl>
+    <w:lvl w:ilvl="1" w:tplc="04090019" w:tentative="1">
+      <w:start w:val="1"/>
+      <w:numFmt w:val="lowerLetter"/>
+      <w:lvlText w:val="%2."/>
+      <w:lvlJc w:val="left"/>
+      <w:pPr>
+        <w:ind w:left="1080" w:hanging="360"/>
+      </w:pPr>
+    </w:lvl>
+    <w:lvl w:ilvl="2" w:tplc="0409001B" w:tentative="1">
+      <w:start w:val="1"/>
+      <w:numFmt w:val="lowerRoman"/>
+      <w:lvlText w:val="%3."/>
+      <w:lvlJc w:val="right"/>
+      <w:pPr>
+        <w:ind w:left="1800" w:hanging="180"/>
+      </w:pPr>
+    </w:lvl>
+    <w:lvl w:ilvl="3" w:tplc="0409000F" w:tentative="1">
+      <w:start w:val="1"/>
+      <w:numFmt w:val="decimal"/>
+      <w:lvlText w:val="%4."/>
+      <w:lvlJc w:val="left"/>
+      <w:pPr>
+        <w:ind w:left="2520" w:hanging="360"/>
+      </w:pPr>
+    </w:lvl>
+    <w:lvl w:ilvl="4" w:tplc="04090019" w:tentative="1">
+      <w:start w:val="1"/>
+      <w:numFmt w:val="lowerLetter"/>
+      <w:lvlText w:val="%5."/>
+      <w:lvlJc w:val="left"/>
+      <w:pPr>
+        <w:ind w:left="3240" w:hanging="360"/>
+      </w:pPr>
+    </w:lvl>
+    <w:lvl w:ilvl="5" w:tplc="0409001B" w:tentative="1">
+      <w:start w:val="1"/>
+      <w:numFmt w:val="lowerRoman"/>
+      <w:lvlText w:val="%6."/>
+      <w:lvlJc w:val="right"/>
+      <w:pPr>
+        <w:ind w:left="3960" w:hanging="180"/>
+      </w:pPr>
+    </w:lvl>
+    <w:lvl w:ilvl="6" w:tplc="0409000F" w:tentative="1">
+      <w:start w:val="1"/>
+      <w:numFmt w:val="decimal"/>
+      <w:lvlText w:val="%7."/>
+      <w:lvlJc w:val="left"/>
+      <w:pPr>
+        <w:ind w:left="4680" w:hanging="360"/>
+      </w:pPr>
+    </w:lvl>
+    <w:lvl w:ilvl="7" w:tplc="04090019" w:tentative="1">
+      <w:start w:val="1"/>
+      <w:numFmt w:val="lowerLetter"/>
+      <w:lvlText w:val="%8."/>
+      <w:lvlJc w:val="left"/>
+      <w:pPr>
+        <w:ind w:left="5400" w:hanging="360"/>
+      </w:pPr>
+    </w:lvl>
+    <w:lvl w:ilvl="8" w:tplc="0409001B" w:tentative="1">
+      <w:start w:val="1"/>
+      <w:numFmt w:val="lowerRoman"/>
+      <w:lvlText w:val="%9."/>
+      <w:lvlJc w:val="right"/>
+      <w:pPr>
+        <w:ind w:left="6120" w:hanging="180"/>
+      </w:pPr>
+    </w:lvl>
+  </w:abstractNum>
+  <w:abstractNum w:abstractNumId="32" w15:restartNumberingAfterBreak="0">
     <w:nsid w:val="3C874F48"/>
     <w:multiLevelType w:val="multilevel"/>
     <w:tmpl w:val="AD5C1AB4"/>
@@ -5909,7 +6676,7 @@
       </w:rPr>
     </w:lvl>
   </w:abstractNum>
-  <w:abstractNum w:abstractNumId="31" w15:restartNumberingAfterBreak="0">
+  <w:abstractNum w:abstractNumId="33" w15:restartNumberingAfterBreak="0">
     <w:nsid w:val="3D616AA3"/>
     <w:multiLevelType w:val="multilevel"/>
     <w:tmpl w:val="882431EC"/>
@@ -6058,7 +6825,7 @@
       </w:rPr>
     </w:lvl>
   </w:abstractNum>
-  <w:abstractNum w:abstractNumId="32" w15:restartNumberingAfterBreak="0">
+  <w:abstractNum w:abstractNumId="34" w15:restartNumberingAfterBreak="0">
     <w:nsid w:val="3E341FBA"/>
     <w:multiLevelType w:val="multilevel"/>
     <w:tmpl w:val="8F0AF106"/>
@@ -6207,7 +6974,7 @@
       </w:rPr>
     </w:lvl>
   </w:abstractNum>
-  <w:abstractNum w:abstractNumId="33" w15:restartNumberingAfterBreak="0">
+  <w:abstractNum w:abstractNumId="35" w15:restartNumberingAfterBreak="0">
     <w:nsid w:val="3E557E8B"/>
     <w:multiLevelType w:val="multilevel"/>
     <w:tmpl w:val="F5B001F2"/>
@@ -6359,7 +7126,7 @@
       </w:rPr>
     </w:lvl>
   </w:abstractNum>
-  <w:abstractNum w:abstractNumId="34" w15:restartNumberingAfterBreak="0">
+  <w:abstractNum w:abstractNumId="36" w15:restartNumberingAfterBreak="0">
     <w:nsid w:val="3F6D6D19"/>
     <w:multiLevelType w:val="multilevel"/>
     <w:tmpl w:val="D22EEDD4"/>
@@ -6506,7 +7273,7 @@
       </w:rPr>
     </w:lvl>
   </w:abstractNum>
-  <w:abstractNum w:abstractNumId="35" w15:restartNumberingAfterBreak="0">
+  <w:abstractNum w:abstractNumId="37" w15:restartNumberingAfterBreak="0">
     <w:nsid w:val="415176CD"/>
     <w:multiLevelType w:val="multilevel"/>
     <w:tmpl w:val="CE46F220"/>
@@ -6655,7 +7422,7 @@
       </w:rPr>
     </w:lvl>
   </w:abstractNum>
-  <w:abstractNum w:abstractNumId="36" w15:restartNumberingAfterBreak="0">
+  <w:abstractNum w:abstractNumId="38" w15:restartNumberingAfterBreak="0">
     <w:nsid w:val="415931F2"/>
     <w:multiLevelType w:val="multilevel"/>
     <w:tmpl w:val="8CC4BB2A"/>
@@ -6804,7 +7571,7 @@
       </w:rPr>
     </w:lvl>
   </w:abstractNum>
-  <w:abstractNum w:abstractNumId="37" w15:restartNumberingAfterBreak="0">
+  <w:abstractNum w:abstractNumId="39" w15:restartNumberingAfterBreak="0">
     <w:nsid w:val="43F25CD8"/>
     <w:multiLevelType w:val="hybridMultilevel"/>
     <w:tmpl w:val="3AE60D88"/>
@@ -6917,7 +7684,7 @@
       </w:rPr>
     </w:lvl>
   </w:abstractNum>
-  <w:abstractNum w:abstractNumId="38" w15:restartNumberingAfterBreak="0">
+  <w:abstractNum w:abstractNumId="40" w15:restartNumberingAfterBreak="0">
     <w:nsid w:val="46501F40"/>
     <w:multiLevelType w:val="multilevel"/>
     <w:tmpl w:val="41629D38"/>
@@ -7066,7 +7833,7 @@
       </w:rPr>
     </w:lvl>
   </w:abstractNum>
-  <w:abstractNum w:abstractNumId="39" w15:restartNumberingAfterBreak="0">
+  <w:abstractNum w:abstractNumId="41" w15:restartNumberingAfterBreak="0">
     <w:nsid w:val="467B0D01"/>
     <w:multiLevelType w:val="hybridMultilevel"/>
     <w:tmpl w:val="47643D90"/>
@@ -7179,7 +7946,7 @@
       </w:rPr>
     </w:lvl>
   </w:abstractNum>
-  <w:abstractNum w:abstractNumId="40" w15:restartNumberingAfterBreak="0">
+  <w:abstractNum w:abstractNumId="42" w15:restartNumberingAfterBreak="0">
     <w:nsid w:val="474B38BC"/>
     <w:multiLevelType w:val="multilevel"/>
     <w:tmpl w:val="984AD838"/>
@@ -7328,7 +8095,7 @@
       </w:rPr>
     </w:lvl>
   </w:abstractNum>
-  <w:abstractNum w:abstractNumId="41" w15:restartNumberingAfterBreak="0">
+  <w:abstractNum w:abstractNumId="43" w15:restartNumberingAfterBreak="0">
     <w:nsid w:val="48DF548A"/>
     <w:multiLevelType w:val="multilevel"/>
     <w:tmpl w:val="495A97C4"/>
@@ -7441,7 +8208,7 @@
       </w:pPr>
     </w:lvl>
   </w:abstractNum>
-  <w:abstractNum w:abstractNumId="42" w15:restartNumberingAfterBreak="0">
+  <w:abstractNum w:abstractNumId="44" w15:restartNumberingAfterBreak="0">
     <w:nsid w:val="4AAA15B9"/>
     <w:multiLevelType w:val="multilevel"/>
     <w:tmpl w:val="439C1A66"/>
@@ -7590,7 +8357,7 @@
       </w:rPr>
     </w:lvl>
   </w:abstractNum>
-  <w:abstractNum w:abstractNumId="43" w15:restartNumberingAfterBreak="0">
+  <w:abstractNum w:abstractNumId="45" w15:restartNumberingAfterBreak="0">
     <w:nsid w:val="4D1F5B68"/>
     <w:multiLevelType w:val="multilevel"/>
     <w:tmpl w:val="D22EEDD4"/>
@@ -7736,7 +8503,7 @@
       </w:rPr>
     </w:lvl>
   </w:abstractNum>
-  <w:abstractNum w:abstractNumId="44" w15:restartNumberingAfterBreak="0">
+  <w:abstractNum w:abstractNumId="46" w15:restartNumberingAfterBreak="0">
     <w:nsid w:val="512B1A69"/>
     <w:multiLevelType w:val="multilevel"/>
     <w:tmpl w:val="D22EEDD4"/>
@@ -7883,7 +8650,7 @@
       </w:rPr>
     </w:lvl>
   </w:abstractNum>
-  <w:abstractNum w:abstractNumId="45" w15:restartNumberingAfterBreak="0">
+  <w:abstractNum w:abstractNumId="47" w15:restartNumberingAfterBreak="0">
     <w:nsid w:val="541034EF"/>
     <w:multiLevelType w:val="multilevel"/>
     <w:tmpl w:val="4B44D176"/>
@@ -7996,7 +8763,7 @@
       </w:pPr>
     </w:lvl>
   </w:abstractNum>
-  <w:abstractNum w:abstractNumId="46" w15:restartNumberingAfterBreak="0">
+  <w:abstractNum w:abstractNumId="48" w15:restartNumberingAfterBreak="0">
     <w:nsid w:val="58FF7E3E"/>
     <w:multiLevelType w:val="multilevel"/>
     <w:tmpl w:val="AD5C1AB4"/>
@@ -8145,7 +8912,7 @@
       </w:rPr>
     </w:lvl>
   </w:abstractNum>
-  <w:abstractNum w:abstractNumId="47" w15:restartNumberingAfterBreak="0">
+  <w:abstractNum w:abstractNumId="49" w15:restartNumberingAfterBreak="0">
     <w:nsid w:val="5B5464AE"/>
     <w:multiLevelType w:val="multilevel"/>
     <w:tmpl w:val="D22EEDD4"/>
@@ -8292,7 +9059,7 @@
       </w:rPr>
     </w:lvl>
   </w:abstractNum>
-  <w:abstractNum w:abstractNumId="48" w15:restartNumberingAfterBreak="0">
+  <w:abstractNum w:abstractNumId="50" w15:restartNumberingAfterBreak="0">
     <w:nsid w:val="5E314008"/>
     <w:multiLevelType w:val="hybridMultilevel"/>
     <w:tmpl w:val="70A4C462"/>
@@ -8405,7 +9172,7 @@
       </w:rPr>
     </w:lvl>
   </w:abstractNum>
-  <w:abstractNum w:abstractNumId="49" w15:restartNumberingAfterBreak="0">
+  <w:abstractNum w:abstractNumId="51" w15:restartNumberingAfterBreak="0">
     <w:nsid w:val="61205947"/>
     <w:multiLevelType w:val="multilevel"/>
     <w:tmpl w:val="F5B001F2"/>
@@ -8557,7 +9324,7 @@
       </w:rPr>
     </w:lvl>
   </w:abstractNum>
-  <w:abstractNum w:abstractNumId="50" w15:restartNumberingAfterBreak="0">
+  <w:abstractNum w:abstractNumId="52" w15:restartNumberingAfterBreak="0">
     <w:nsid w:val="62F77B29"/>
     <w:multiLevelType w:val="multilevel"/>
     <w:tmpl w:val="D22EEDD4"/>
@@ -8703,7 +9470,120 @@
       </w:rPr>
     </w:lvl>
   </w:abstractNum>
-  <w:abstractNum w:abstractNumId="51" w15:restartNumberingAfterBreak="0">
+  <w:abstractNum w:abstractNumId="53" w15:restartNumberingAfterBreak="0">
+    <w:nsid w:val="63B02E96"/>
+    <w:multiLevelType w:val="hybridMultilevel"/>
+    <w:tmpl w:val="D054CC9A"/>
+    <w:lvl w:ilvl="0" w:tplc="04090001">
+      <w:start w:val="1"/>
+      <w:numFmt w:val="bullet"/>
+      <w:lvlText w:val=""/>
+      <w:lvlJc w:val="left"/>
+      <w:pPr>
+        <w:ind w:left="1080" w:hanging="360"/>
+      </w:pPr>
+      <w:rPr>
+        <w:rFonts w:ascii="Symbol" w:hAnsi="Symbol" w:hint="default"/>
+      </w:rPr>
+    </w:lvl>
+    <w:lvl w:ilvl="1" w:tplc="04090003" w:tentative="1">
+      <w:start w:val="1"/>
+      <w:numFmt w:val="bullet"/>
+      <w:lvlText w:val="o"/>
+      <w:lvlJc w:val="left"/>
+      <w:pPr>
+        <w:ind w:left="1800" w:hanging="360"/>
+      </w:pPr>
+      <w:rPr>
+        <w:rFonts w:ascii="Courier New" w:hAnsi="Courier New" w:cs="Courier New" w:hint="default"/>
+      </w:rPr>
+    </w:lvl>
+    <w:lvl w:ilvl="2" w:tplc="04090005" w:tentative="1">
+      <w:start w:val="1"/>
+      <w:numFmt w:val="bullet"/>
+      <w:lvlText w:val=""/>
+      <w:lvlJc w:val="left"/>
+      <w:pPr>
+        <w:ind w:left="2520" w:hanging="360"/>
+      </w:pPr>
+      <w:rPr>
+        <w:rFonts w:ascii="Wingdings" w:hAnsi="Wingdings" w:hint="default"/>
+      </w:rPr>
+    </w:lvl>
+    <w:lvl w:ilvl="3" w:tplc="04090001" w:tentative="1">
+      <w:start w:val="1"/>
+      <w:numFmt w:val="bullet"/>
+      <w:lvlText w:val=""/>
+      <w:lvlJc w:val="left"/>
+      <w:pPr>
+        <w:ind w:left="3240" w:hanging="360"/>
+      </w:pPr>
+      <w:rPr>
+        <w:rFonts w:ascii="Symbol" w:hAnsi="Symbol" w:hint="default"/>
+      </w:rPr>
+    </w:lvl>
+    <w:lvl w:ilvl="4" w:tplc="04090003" w:tentative="1">
+      <w:start w:val="1"/>
+      <w:numFmt w:val="bullet"/>
+      <w:lvlText w:val="o"/>
+      <w:lvlJc w:val="left"/>
+      <w:pPr>
+        <w:ind w:left="3960" w:hanging="360"/>
+      </w:pPr>
+      <w:rPr>
+        <w:rFonts w:ascii="Courier New" w:hAnsi="Courier New" w:cs="Courier New" w:hint="default"/>
+      </w:rPr>
+    </w:lvl>
+    <w:lvl w:ilvl="5" w:tplc="04090005" w:tentative="1">
+      <w:start w:val="1"/>
+      <w:numFmt w:val="bullet"/>
+      <w:lvlText w:val=""/>
+      <w:lvlJc w:val="left"/>
+      <w:pPr>
+        <w:ind w:left="4680" w:hanging="360"/>
+      </w:pPr>
+      <w:rPr>
+        <w:rFonts w:ascii="Wingdings" w:hAnsi="Wingdings" w:hint="default"/>
+      </w:rPr>
+    </w:lvl>
+    <w:lvl w:ilvl="6" w:tplc="04090001" w:tentative="1">
+      <w:start w:val="1"/>
+      <w:numFmt w:val="bullet"/>
+      <w:lvlText w:val=""/>
+      <w:lvlJc w:val="left"/>
+      <w:pPr>
+        <w:ind w:left="5400" w:hanging="360"/>
+      </w:pPr>
+      <w:rPr>
+        <w:rFonts w:ascii="Symbol" w:hAnsi="Symbol" w:hint="default"/>
+      </w:rPr>
+    </w:lvl>
+    <w:lvl w:ilvl="7" w:tplc="04090003" w:tentative="1">
+      <w:start w:val="1"/>
+      <w:numFmt w:val="bullet"/>
+      <w:lvlText w:val="o"/>
+      <w:lvlJc w:val="left"/>
+      <w:pPr>
+        <w:ind w:left="6120" w:hanging="360"/>
+      </w:pPr>
+      <w:rPr>
+        <w:rFonts w:ascii="Courier New" w:hAnsi="Courier New" w:cs="Courier New" w:hint="default"/>
+      </w:rPr>
+    </w:lvl>
+    <w:lvl w:ilvl="8" w:tplc="04090005" w:tentative="1">
+      <w:start w:val="1"/>
+      <w:numFmt w:val="bullet"/>
+      <w:lvlText w:val=""/>
+      <w:lvlJc w:val="left"/>
+      <w:pPr>
+        <w:ind w:left="6840" w:hanging="360"/>
+      </w:pPr>
+      <w:rPr>
+        <w:rFonts w:ascii="Wingdings" w:hAnsi="Wingdings" w:hint="default"/>
+      </w:rPr>
+    </w:lvl>
+  </w:abstractNum>
+  <w:abstractNum w:abstractNumId="54" w15:restartNumberingAfterBreak="0">
     <w:nsid w:val="63DA71CA"/>
     <w:multiLevelType w:val="hybridMultilevel"/>
     <w:tmpl w:val="59207FBC"/>
@@ -8816,7 +9696,7 @@
       </w:rPr>
     </w:lvl>
   </w:abstractNum>
-  <w:abstractNum w:abstractNumId="52" w15:restartNumberingAfterBreak="0">
+  <w:abstractNum w:abstractNumId="55" w15:restartNumberingAfterBreak="0">
     <w:nsid w:val="6622768E"/>
     <w:multiLevelType w:val="multilevel"/>
     <w:tmpl w:val="DBA01C36"/>
@@ -8965,7 +9845,7 @@
       </w:rPr>
     </w:lvl>
   </w:abstractNum>
-  <w:abstractNum w:abstractNumId="53" w15:restartNumberingAfterBreak="0">
+  <w:abstractNum w:abstractNumId="56" w15:restartNumberingAfterBreak="0">
     <w:nsid w:val="664537F2"/>
     <w:multiLevelType w:val="multilevel"/>
     <w:tmpl w:val="1DD84828"/>
@@ -9114,7 +9994,7 @@
       </w:rPr>
     </w:lvl>
   </w:abstractNum>
-  <w:abstractNum w:abstractNumId="54" w15:restartNumberingAfterBreak="0">
+  <w:abstractNum w:abstractNumId="57" w15:restartNumberingAfterBreak="0">
     <w:nsid w:val="665D5A91"/>
     <w:multiLevelType w:val="multilevel"/>
     <w:tmpl w:val="4B44D176"/>
@@ -9227,7 +10107,7 @@
       </w:pPr>
     </w:lvl>
   </w:abstractNum>
-  <w:abstractNum w:abstractNumId="55" w15:restartNumberingAfterBreak="0">
+  <w:abstractNum w:abstractNumId="58" w15:restartNumberingAfterBreak="0">
     <w:nsid w:val="67A90D49"/>
     <w:multiLevelType w:val="multilevel"/>
     <w:tmpl w:val="9BE04700"/>
@@ -9376,7 +10256,7 @@
       </w:rPr>
     </w:lvl>
   </w:abstractNum>
-  <w:abstractNum w:abstractNumId="56" w15:restartNumberingAfterBreak="0">
+  <w:abstractNum w:abstractNumId="59" w15:restartNumberingAfterBreak="0">
     <w:nsid w:val="68392B11"/>
     <w:multiLevelType w:val="multilevel"/>
     <w:tmpl w:val="AD5C1AB4"/>
@@ -9525,7 +10405,7 @@
       </w:rPr>
     </w:lvl>
   </w:abstractNum>
-  <w:abstractNum w:abstractNumId="57" w15:restartNumberingAfterBreak="0">
+  <w:abstractNum w:abstractNumId="60" w15:restartNumberingAfterBreak="0">
     <w:nsid w:val="69A94463"/>
     <w:multiLevelType w:val="multilevel"/>
     <w:tmpl w:val="4B44D176"/>
@@ -9642,7 +10522,7 @@
       </w:pPr>
     </w:lvl>
   </w:abstractNum>
-  <w:abstractNum w:abstractNumId="58" w15:restartNumberingAfterBreak="0">
+  <w:abstractNum w:abstractNumId="61" w15:restartNumberingAfterBreak="0">
     <w:nsid w:val="6AE76E32"/>
     <w:multiLevelType w:val="multilevel"/>
     <w:tmpl w:val="6CA8E43C"/>
@@ -9755,7 +10635,7 @@
       </w:pPr>
     </w:lvl>
   </w:abstractNum>
-  <w:abstractNum w:abstractNumId="59" w15:restartNumberingAfterBreak="0">
+  <w:abstractNum w:abstractNumId="62" w15:restartNumberingAfterBreak="0">
     <w:nsid w:val="6BC53E38"/>
     <w:multiLevelType w:val="multilevel"/>
     <w:tmpl w:val="33B0617A"/>
@@ -9904,7 +10784,7 @@
       </w:rPr>
     </w:lvl>
   </w:abstractNum>
-  <w:abstractNum w:abstractNumId="60" w15:restartNumberingAfterBreak="0">
+  <w:abstractNum w:abstractNumId="63" w15:restartNumberingAfterBreak="0">
     <w:nsid w:val="73056118"/>
     <w:multiLevelType w:val="multilevel"/>
     <w:tmpl w:val="D22EEDD4"/>
@@ -10050,7 +10930,7 @@
       </w:rPr>
     </w:lvl>
   </w:abstractNum>
-  <w:abstractNum w:abstractNumId="61" w15:restartNumberingAfterBreak="0">
+  <w:abstractNum w:abstractNumId="64" w15:restartNumberingAfterBreak="0">
     <w:nsid w:val="749C58B3"/>
     <w:multiLevelType w:val="multilevel"/>
     <w:tmpl w:val="15AEF154"/>
@@ -10199,7 +11079,120 @@
       </w:rPr>
     </w:lvl>
   </w:abstractNum>
-  <w:abstractNum w:abstractNumId="62" w15:restartNumberingAfterBreak="0">
+  <w:abstractNum w:abstractNumId="65" w15:restartNumberingAfterBreak="0">
+    <w:nsid w:val="76393A8F"/>
+    <w:multiLevelType w:val="hybridMultilevel"/>
+    <w:tmpl w:val="9AD6685E"/>
+    <w:lvl w:ilvl="0" w:tplc="04090001">
+      <w:start w:val="1"/>
+      <w:numFmt w:val="bullet"/>
+      <w:lvlText w:val=""/>
+      <w:lvlJc w:val="left"/>
+      <w:pPr>
+        <w:ind w:left="1080" w:hanging="360"/>
+      </w:pPr>
+      <w:rPr>
+        <w:rFonts w:ascii="Symbol" w:hAnsi="Symbol" w:hint="default"/>
+      </w:rPr>
+    </w:lvl>
+    <w:lvl w:ilvl="1" w:tplc="04090003" w:tentative="1">
+      <w:start w:val="1"/>
+      <w:numFmt w:val="bullet"/>
+      <w:lvlText w:val="o"/>
+      <w:lvlJc w:val="left"/>
+      <w:pPr>
+        <w:ind w:left="1800" w:hanging="360"/>
+      </w:pPr>
+      <w:rPr>
+        <w:rFonts w:ascii="Courier New" w:hAnsi="Courier New" w:cs="Courier New" w:hint="default"/>
+      </w:rPr>
+    </w:lvl>
+    <w:lvl w:ilvl="2" w:tplc="04090005" w:tentative="1">
+      <w:start w:val="1"/>
+      <w:numFmt w:val="bullet"/>
+      <w:lvlText w:val=""/>
+      <w:lvlJc w:val="left"/>
+      <w:pPr>
+        <w:ind w:left="2520" w:hanging="360"/>
+      </w:pPr>
+      <w:rPr>
+        <w:rFonts w:ascii="Wingdings" w:hAnsi="Wingdings" w:hint="default"/>
+      </w:rPr>
+    </w:lvl>
+    <w:lvl w:ilvl="3" w:tplc="04090001" w:tentative="1">
+      <w:start w:val="1"/>
+      <w:numFmt w:val="bullet"/>
+      <w:lvlText w:val=""/>
+      <w:lvlJc w:val="left"/>
+      <w:pPr>
+        <w:ind w:left="3240" w:hanging="360"/>
+      </w:pPr>
+      <w:rPr>
+        <w:rFonts w:ascii="Symbol" w:hAnsi="Symbol" w:hint="default"/>
+      </w:rPr>
+    </w:lvl>
+    <w:lvl w:ilvl="4" w:tplc="04090003" w:tentative="1">
+      <w:start w:val="1"/>
+      <w:numFmt w:val="bullet"/>
+      <w:lvlText w:val="o"/>
+      <w:lvlJc w:val="left"/>
+      <w:pPr>
+        <w:ind w:left="3960" w:hanging="360"/>
+      </w:pPr>
+      <w:rPr>
+        <w:rFonts w:ascii="Courier New" w:hAnsi="Courier New" w:cs="Courier New" w:hint="default"/>
+      </w:rPr>
+    </w:lvl>
+    <w:lvl w:ilvl="5" w:tplc="04090005" w:tentative="1">
+      <w:start w:val="1"/>
+      <w:numFmt w:val="bullet"/>
+      <w:lvlText w:val=""/>
+      <w:lvlJc w:val="left"/>
+      <w:pPr>
+        <w:ind w:left="4680" w:hanging="360"/>
+      </w:pPr>
+      <w:rPr>
+        <w:rFonts w:ascii="Wingdings" w:hAnsi="Wingdings" w:hint="default"/>
+      </w:rPr>
+    </w:lvl>
+    <w:lvl w:ilvl="6" w:tplc="04090001" w:tentative="1">
+      <w:start w:val="1"/>
+      <w:numFmt w:val="bullet"/>
+      <w:lvlText w:val=""/>
+      <w:lvlJc w:val="left"/>
+      <w:pPr>
+        <w:ind w:left="5400" w:hanging="360"/>
+      </w:pPr>
+      <w:rPr>
+        <w:rFonts w:ascii="Symbol" w:hAnsi="Symbol" w:hint="default"/>
+      </w:rPr>
+    </w:lvl>
+    <w:lvl w:ilvl="7" w:tplc="04090003" w:tentative="1">
+      <w:start w:val="1"/>
+      <w:numFmt w:val="bullet"/>
+      <w:lvlText w:val="o"/>
+      <w:lvlJc w:val="left"/>
+      <w:pPr>
+        <w:ind w:left="6120" w:hanging="360"/>
+      </w:pPr>
+      <w:rPr>
+        <w:rFonts w:ascii="Courier New" w:hAnsi="Courier New" w:cs="Courier New" w:hint="default"/>
+      </w:rPr>
+    </w:lvl>
+    <w:lvl w:ilvl="8" w:tplc="04090005" w:tentative="1">
+      <w:start w:val="1"/>
+      <w:numFmt w:val="bullet"/>
+      <w:lvlText w:val=""/>
+      <w:lvlJc w:val="left"/>
+      <w:pPr>
+        <w:ind w:left="6840" w:hanging="360"/>
+      </w:pPr>
+      <w:rPr>
+        <w:rFonts w:ascii="Wingdings" w:hAnsi="Wingdings" w:hint="default"/>
+      </w:rPr>
+    </w:lvl>
+  </w:abstractNum>
+  <w:abstractNum w:abstractNumId="66" w15:restartNumberingAfterBreak="0">
     <w:nsid w:val="77C353D4"/>
     <w:multiLevelType w:val="multilevel"/>
     <w:tmpl w:val="828A4E80"/>
@@ -10348,7 +11341,7 @@
       </w:rPr>
     </w:lvl>
   </w:abstractNum>
-  <w:abstractNum w:abstractNumId="63" w15:restartNumberingAfterBreak="0">
+  <w:abstractNum w:abstractNumId="67" w15:restartNumberingAfterBreak="0">
     <w:nsid w:val="78552A01"/>
     <w:multiLevelType w:val="multilevel"/>
     <w:tmpl w:val="3556A2CC"/>
@@ -10497,7 +11490,7 @@
       </w:rPr>
     </w:lvl>
   </w:abstractNum>
-  <w:abstractNum w:abstractNumId="64" w15:restartNumberingAfterBreak="0">
+  <w:abstractNum w:abstractNumId="68" w15:restartNumberingAfterBreak="0">
     <w:nsid w:val="7C617400"/>
     <w:multiLevelType w:val="multilevel"/>
     <w:tmpl w:val="0E646272"/>
@@ -10646,7 +11639,7 @@
       </w:rPr>
     </w:lvl>
   </w:abstractNum>
-  <w:abstractNum w:abstractNumId="65" w15:restartNumberingAfterBreak="0">
+  <w:abstractNum w:abstractNumId="69" w15:restartNumberingAfterBreak="0">
     <w:nsid w:val="7F053E82"/>
     <w:multiLevelType w:val="hybridMultilevel"/>
     <w:tmpl w:val="8C28640A"/>
@@ -10733,187 +11726,187 @@
     </w:lvl>
   </w:abstractNum>
   <w:num w:numId="1" w16cid:durableId="1297174915">
-    <w:abstractNumId w:val="2"/>
+    <w:abstractNumId w:val="3"/>
   </w:num>
   <w:num w:numId="2" w16cid:durableId="2105031117">
-    <w:abstractNumId w:val="32"/>
+    <w:abstractNumId w:val="34"/>
   </w:num>
   <w:num w:numId="3" w16cid:durableId="360715682">
-    <w:abstractNumId w:val="54"/>
+    <w:abstractNumId w:val="57"/>
   </w:num>
   <w:num w:numId="4" w16cid:durableId="228272565">
+    <w:abstractNumId w:val="41"/>
+  </w:num>
+  <w:num w:numId="5" w16cid:durableId="188102188">
+    <w:abstractNumId w:val="4"/>
+  </w:num>
+  <w:num w:numId="6" w16cid:durableId="210073815">
+    <w:abstractNumId w:val="24"/>
+  </w:num>
+  <w:num w:numId="7" w16cid:durableId="260532666">
     <w:abstractNumId w:val="39"/>
   </w:num>
-  <w:num w:numId="5" w16cid:durableId="188102188">
-    <w:abstractNumId w:val="3"/>
-  </w:num>
-  <w:num w:numId="6" w16cid:durableId="210073815">
-    <w:abstractNumId w:val="23"/>
-  </w:num>
-  <w:num w:numId="7" w16cid:durableId="260532666">
-    <w:abstractNumId w:val="37"/>
-  </w:num>
   <w:num w:numId="8" w16cid:durableId="647629789">
-    <w:abstractNumId w:val="48"/>
+    <w:abstractNumId w:val="50"/>
   </w:num>
   <w:num w:numId="9" w16cid:durableId="1202061867">
-    <w:abstractNumId w:val="57"/>
+    <w:abstractNumId w:val="60"/>
   </w:num>
   <w:num w:numId="10" w16cid:durableId="156767161">
-    <w:abstractNumId w:val="45"/>
+    <w:abstractNumId w:val="47"/>
   </w:num>
   <w:num w:numId="11" w16cid:durableId="2011058566">
-    <w:abstractNumId w:val="5"/>
+    <w:abstractNumId w:val="6"/>
   </w:num>
   <w:num w:numId="12" w16cid:durableId="2126120158">
-    <w:abstractNumId w:val="27"/>
+    <w:abstractNumId w:val="28"/>
   </w:num>
   <w:num w:numId="13" w16cid:durableId="1398892855">
-    <w:abstractNumId w:val="6"/>
+    <w:abstractNumId w:val="7"/>
   </w:num>
   <w:num w:numId="14" w16cid:durableId="1627354257">
+    <w:abstractNumId w:val="22"/>
+  </w:num>
+  <w:num w:numId="15" w16cid:durableId="1562864218">
+    <w:abstractNumId w:val="26"/>
+  </w:num>
+  <w:num w:numId="16" w16cid:durableId="1056393438">
+    <w:abstractNumId w:val="42"/>
+  </w:num>
+  <w:num w:numId="17" w16cid:durableId="1034692335">
     <w:abstractNumId w:val="21"/>
   </w:num>
-  <w:num w:numId="15" w16cid:durableId="1562864218">
-    <w:abstractNumId w:val="25"/>
-  </w:num>
-  <w:num w:numId="16" w16cid:durableId="1056393438">
-    <w:abstractNumId w:val="40"/>
-  </w:num>
-  <w:num w:numId="17" w16cid:durableId="1034692335">
-    <w:abstractNumId w:val="20"/>
-  </w:num>
   <w:num w:numId="18" w16cid:durableId="60445195">
-    <w:abstractNumId w:val="59"/>
+    <w:abstractNumId w:val="62"/>
   </w:num>
   <w:num w:numId="19" w16cid:durableId="330724267">
-    <w:abstractNumId w:val="7"/>
+    <w:abstractNumId w:val="8"/>
   </w:num>
   <w:num w:numId="20" w16cid:durableId="1396393531">
-    <w:abstractNumId w:val="31"/>
+    <w:abstractNumId w:val="33"/>
   </w:num>
   <w:num w:numId="21" w16cid:durableId="1405758802">
     <w:abstractNumId w:val="0"/>
   </w:num>
   <w:num w:numId="22" w16cid:durableId="546261803">
+    <w:abstractNumId w:val="58"/>
+  </w:num>
+  <w:num w:numId="23" w16cid:durableId="498816192">
+    <w:abstractNumId w:val="68"/>
+  </w:num>
+  <w:num w:numId="24" w16cid:durableId="1161699020">
+    <w:abstractNumId w:val="16"/>
+  </w:num>
+  <w:num w:numId="25" w16cid:durableId="537669940">
+    <w:abstractNumId w:val="37"/>
+  </w:num>
+  <w:num w:numId="26" w16cid:durableId="1188525470">
     <w:abstractNumId w:val="55"/>
   </w:num>
-  <w:num w:numId="23" w16cid:durableId="498816192">
+  <w:num w:numId="27" w16cid:durableId="1322349861">
+    <w:abstractNumId w:val="9"/>
+  </w:num>
+  <w:num w:numId="28" w16cid:durableId="1556546658">
+    <w:abstractNumId w:val="56"/>
+  </w:num>
+  <w:num w:numId="29" w16cid:durableId="186598607">
+    <w:abstractNumId w:val="44"/>
+  </w:num>
+  <w:num w:numId="30" w16cid:durableId="103154515">
+    <w:abstractNumId w:val="67"/>
+  </w:num>
+  <w:num w:numId="31" w16cid:durableId="1876428101">
+    <w:abstractNumId w:val="40"/>
+  </w:num>
+  <w:num w:numId="32" w16cid:durableId="2017154094">
+    <w:abstractNumId w:val="38"/>
+  </w:num>
+  <w:num w:numId="33" w16cid:durableId="509412227">
+    <w:abstractNumId w:val="35"/>
+  </w:num>
+  <w:num w:numId="34" w16cid:durableId="1570192368">
+    <w:abstractNumId w:val="51"/>
+  </w:num>
+  <w:num w:numId="35" w16cid:durableId="1678651459">
+    <w:abstractNumId w:val="27"/>
+  </w:num>
+  <w:num w:numId="36" w16cid:durableId="552617362">
+    <w:abstractNumId w:val="32"/>
+  </w:num>
+  <w:num w:numId="37" w16cid:durableId="1446732064">
+    <w:abstractNumId w:val="17"/>
+  </w:num>
+  <w:num w:numId="38" w16cid:durableId="966622559">
+    <w:abstractNumId w:val="48"/>
+  </w:num>
+  <w:num w:numId="39" w16cid:durableId="513543315">
+    <w:abstractNumId w:val="59"/>
+  </w:num>
+  <w:num w:numId="40" w16cid:durableId="137847652">
+    <w:abstractNumId w:val="11"/>
+  </w:num>
+  <w:num w:numId="41" w16cid:durableId="1413237400">
+    <w:abstractNumId w:val="29"/>
+  </w:num>
+  <w:num w:numId="42" w16cid:durableId="125053502">
+    <w:abstractNumId w:val="49"/>
+  </w:num>
+  <w:num w:numId="43" w16cid:durableId="369258724">
+    <w:abstractNumId w:val="36"/>
+  </w:num>
+  <w:num w:numId="44" w16cid:durableId="1302035015">
+    <w:abstractNumId w:val="23"/>
+  </w:num>
+  <w:num w:numId="45" w16cid:durableId="824706685">
+    <w:abstractNumId w:val="46"/>
+  </w:num>
+  <w:num w:numId="46" w16cid:durableId="144392399">
+    <w:abstractNumId w:val="15"/>
+  </w:num>
+  <w:num w:numId="47" w16cid:durableId="1560703206">
+    <w:abstractNumId w:val="10"/>
+  </w:num>
+  <w:num w:numId="48" w16cid:durableId="1468012858">
     <w:abstractNumId w:val="64"/>
   </w:num>
-  <w:num w:numId="24" w16cid:durableId="1161699020">
-    <w:abstractNumId w:val="15"/>
+  <w:num w:numId="49" w16cid:durableId="2013754073">
+    <w:abstractNumId w:val="66"/>
   </w:num>
-  <w:num w:numId="25" w16cid:durableId="537669940">
-    <w:abstractNumId w:val="35"/>
+  <w:num w:numId="50" w16cid:durableId="1994328295">
+    <w:abstractNumId w:val="30"/>
   </w:num>
-  <w:num w:numId="26" w16cid:durableId="1188525470">
+  <w:num w:numId="51" w16cid:durableId="961425340">
+    <w:abstractNumId w:val="20"/>
+  </w:num>
+  <w:num w:numId="52" w16cid:durableId="1794517537">
+    <w:abstractNumId w:val="54"/>
+  </w:num>
+  <w:num w:numId="53" w16cid:durableId="1437946667">
     <w:abstractNumId w:val="52"/>
   </w:num>
-  <w:num w:numId="27" w16cid:durableId="1322349861">
-    <w:abstractNumId w:val="8"/>
-  </w:num>
-  <w:num w:numId="28" w16cid:durableId="1556546658">
-    <w:abstractNumId w:val="53"/>
-  </w:num>
-  <w:num w:numId="29" w16cid:durableId="186598607">
-    <w:abstractNumId w:val="42"/>
-  </w:num>
-  <w:num w:numId="30" w16cid:durableId="103154515">
+  <w:num w:numId="54" w16cid:durableId="1298335770">
     <w:abstractNumId w:val="63"/>
   </w:num>
-  <w:num w:numId="31" w16cid:durableId="1876428101">
-    <w:abstractNumId w:val="38"/>
-  </w:num>
-  <w:num w:numId="32" w16cid:durableId="2017154094">
-    <w:abstractNumId w:val="36"/>
-  </w:num>
-  <w:num w:numId="33" w16cid:durableId="509412227">
-    <w:abstractNumId w:val="33"/>
-  </w:num>
-  <w:num w:numId="34" w16cid:durableId="1570192368">
-    <w:abstractNumId w:val="49"/>
-  </w:num>
-  <w:num w:numId="35" w16cid:durableId="1678651459">
-    <w:abstractNumId w:val="26"/>
-  </w:num>
-  <w:num w:numId="36" w16cid:durableId="552617362">
-    <w:abstractNumId w:val="30"/>
-  </w:num>
-  <w:num w:numId="37" w16cid:durableId="1446732064">
-    <w:abstractNumId w:val="16"/>
-  </w:num>
-  <w:num w:numId="38" w16cid:durableId="966622559">
-    <w:abstractNumId w:val="46"/>
-  </w:num>
-  <w:num w:numId="39" w16cid:durableId="513543315">
-    <w:abstractNumId w:val="56"/>
-  </w:num>
-  <w:num w:numId="40" w16cid:durableId="137847652">
-    <w:abstractNumId w:val="10"/>
-  </w:num>
-  <w:num w:numId="41" w16cid:durableId="1413237400">
-    <w:abstractNumId w:val="28"/>
-  </w:num>
-  <w:num w:numId="42" w16cid:durableId="125053502">
-    <w:abstractNumId w:val="47"/>
-  </w:num>
-  <w:num w:numId="43" w16cid:durableId="369258724">
-    <w:abstractNumId w:val="34"/>
-  </w:num>
-  <w:num w:numId="44" w16cid:durableId="1302035015">
-    <w:abstractNumId w:val="22"/>
-  </w:num>
-  <w:num w:numId="45" w16cid:durableId="824706685">
-    <w:abstractNumId w:val="44"/>
-  </w:num>
-  <w:num w:numId="46" w16cid:durableId="144392399">
+  <w:num w:numId="55" w16cid:durableId="151532050">
     <w:abstractNumId w:val="14"/>
   </w:num>
-  <w:num w:numId="47" w16cid:durableId="1560703206">
-    <w:abstractNumId w:val="9"/>
+  <w:num w:numId="56" w16cid:durableId="1444615297">
+    <w:abstractNumId w:val="45"/>
   </w:num>
-  <w:num w:numId="48" w16cid:durableId="1468012858">
+  <w:num w:numId="57" w16cid:durableId="1548102677">
+    <w:abstractNumId w:val="19"/>
+  </w:num>
+  <w:num w:numId="58" w16cid:durableId="1618760001">
+    <w:abstractNumId w:val="18"/>
+  </w:num>
+  <w:num w:numId="59" w16cid:durableId="656760562">
     <w:abstractNumId w:val="61"/>
   </w:num>
-  <w:num w:numId="49" w16cid:durableId="2013754073">
-    <w:abstractNumId w:val="62"/>
-  </w:num>
-  <w:num w:numId="50" w16cid:durableId="1994328295">
-    <w:abstractNumId w:val="29"/>
-  </w:num>
-  <w:num w:numId="51" w16cid:durableId="961425340">
-    <w:abstractNumId w:val="19"/>
-  </w:num>
-  <w:num w:numId="52" w16cid:durableId="1794517537">
-    <w:abstractNumId w:val="51"/>
-  </w:num>
-  <w:num w:numId="53" w16cid:durableId="1437946667">
-    <w:abstractNumId w:val="50"/>
-  </w:num>
-  <w:num w:numId="54" w16cid:durableId="1298335770">
-    <w:abstractNumId w:val="60"/>
-  </w:num>
-  <w:num w:numId="55" w16cid:durableId="151532050">
-    <w:abstractNumId w:val="13"/>
-  </w:num>
-  <w:num w:numId="56" w16cid:durableId="1444615297">
-    <w:abstractNumId w:val="43"/>
-  </w:num>
-  <w:num w:numId="57" w16cid:durableId="1548102677">
-    <w:abstractNumId w:val="18"/>
-  </w:num>
-  <w:num w:numId="58" w16cid:durableId="1618760001">
-    <w:abstractNumId w:val="17"/>
-  </w:num>
-  <w:num w:numId="59" w16cid:durableId="656760562">
-    <w:abstractNumId w:val="58"/>
-  </w:num>
   <w:num w:numId="60" w16cid:durableId="1925912153">
-    <w:abstractNumId w:val="24"/>
+    <w:abstractNumId w:val="25"/>
   </w:num>
   <w:num w:numId="61" w16cid:durableId="1636986336">
-    <w:abstractNumId w:val="12"/>
+    <w:abstractNumId w:val="13"/>
   </w:num>
   <w:num w:numId="62" w16cid:durableId="1782263817">
     <w:abstractNumId w:val="1"/>
@@ -10939,15 +11932,27 @@
     </w:lvlOverride>
   </w:num>
   <w:num w:numId="64" w16cid:durableId="2007586709">
-    <w:abstractNumId w:val="11"/>
+    <w:abstractNumId w:val="12"/>
   </w:num>
   <w:num w:numId="65" w16cid:durableId="1585914580">
-    <w:abstractNumId w:val="4"/>
+    <w:abstractNumId w:val="5"/>
   </w:num>
   <w:num w:numId="66" w16cid:durableId="2085495234">
-    <w:abstractNumId w:val="41"/>
+    <w:abstractNumId w:val="43"/>
   </w:num>
   <w:num w:numId="67" w16cid:durableId="1819151747">
+    <w:abstractNumId w:val="69"/>
+  </w:num>
+  <w:num w:numId="68" w16cid:durableId="2073842197">
+    <w:abstractNumId w:val="31"/>
+  </w:num>
+  <w:num w:numId="69" w16cid:durableId="1733890136">
+    <w:abstractNumId w:val="2"/>
+  </w:num>
+  <w:num w:numId="70" w16cid:durableId="1399354644">
+    <w:abstractNumId w:val="53"/>
+  </w:num>
+  <w:num w:numId="71" w16cid:durableId="962228794">
     <w:abstractNumId w:val="65"/>
   </w:num>
 </w:numbering>
@@ -11353,7 +12358,7 @@
   <w:style w:type="paragraph" w:default="1" w:styleId="Normal">
     <w:name w:val="Normal"/>
     <w:qFormat/>
-    <w:rsid w:val="00B920E5"/>
+    <w:rsid w:val="00B1088E"/>
   </w:style>
   <w:style w:type="paragraph" w:styleId="Heading1">
     <w:name w:val="heading 1"/>
@@ -11555,6 +12560,7 @@
   <w:style w:type="character" w:default="1" w:styleId="DefaultParagraphFont">
     <w:name w:val="Default Paragraph Font"/>
     <w:uiPriority w:val="1"/>
+    <w:semiHidden/>
     <w:unhideWhenUsed/>
   </w:style>
   <w:style w:type="table" w:default="1" w:styleId="TableNormal">

</xml_diff>

<commit_message>
Added answers to Hometask questions
</commit_message>
<xml_diff>
--- a/02.LayeredArchitectures/Hometask.docx
+++ b/02.LayeredArchitectures/Hometask.docx
@@ -1031,7 +1031,49 @@
         <w:rPr>
           <w:rFonts w:ascii="Verdana" w:hAnsi="Verdana"/>
         </w:rPr>
-        <w:t>Is the below layered architecture correct and why? Is it possible from C to use B? from A to use C?</w:t>
+        <w:t xml:space="preserve">Is the below layered architecture correct and why? Is it possible </w:t>
+      </w:r>
+      <w:proofErr w:type="gramStart"/>
+      <w:r>
+        <w:rPr>
+          <w:rFonts w:ascii="Verdana" w:hAnsi="Verdana"/>
+        </w:rPr>
+        <w:t>from</w:t>
+      </w:r>
+      <w:proofErr w:type="gramEnd"/>
+      <w:r>
+        <w:rPr>
+          <w:rFonts w:ascii="Verdana" w:hAnsi="Verdana"/>
+        </w:rPr>
+        <w:t xml:space="preserve"> C to use B? </w:t>
+      </w:r>
+      <w:proofErr w:type="gramStart"/>
+      <w:r>
+        <w:rPr>
+          <w:rFonts w:ascii="Verdana" w:hAnsi="Verdana"/>
+        </w:rPr>
+        <w:t>from</w:t>
+      </w:r>
+      <w:proofErr w:type="gramEnd"/>
+      <w:r>
+        <w:rPr>
+          <w:rFonts w:ascii="Verdana" w:hAnsi="Verdana"/>
+        </w:rPr>
+        <w:t xml:space="preserve"> A </w:t>
+      </w:r>
+      <w:proofErr w:type="gramStart"/>
+      <w:r>
+        <w:rPr>
+          <w:rFonts w:ascii="Verdana" w:hAnsi="Verdana"/>
+        </w:rPr>
+        <w:t>to use</w:t>
+      </w:r>
+      <w:proofErr w:type="gramEnd"/>
+      <w:r>
+        <w:rPr>
+          <w:rFonts w:ascii="Verdana" w:hAnsi="Verdana"/>
+        </w:rPr>
+        <w:t xml:space="preserve"> C?</w:t>
       </w:r>
       <w:r>
         <w:t xml:space="preserve"> </w:t>
@@ -1254,6 +1296,7 @@
           <w:ilvl w:val="0"/>
           <w:numId w:val="66"/>
         </w:numPr>
+        <w:jc w:val="both"/>
         <w:rPr>
           <w:rFonts w:ascii="Verdana" w:hAnsi="Verdana"/>
         </w:rPr>
@@ -1268,6 +1311,7 @@
     <w:p>
       <w:pPr>
         <w:ind w:left="720"/>
+        <w:jc w:val="both"/>
         <w:rPr>
           <w:rFonts w:ascii="Verdana" w:hAnsi="Verdana"/>
         </w:rPr>
@@ -1376,20 +1420,64 @@
           <w:ilvl w:val="0"/>
           <w:numId w:val="66"/>
         </w:numPr>
-        <w:rPr>
-          <w:rFonts w:ascii="Verdana" w:hAnsi="Verdana"/>
-        </w:rPr>
-      </w:pPr>
-      <w:r>
-        <w:rPr>
-          <w:rFonts w:ascii="Verdana" w:hAnsi="Verdana"/>
-        </w:rPr>
-        <w:t>Is the below layered architecture correct and why? Is it possible from C to use B? from A to use C?</w:t>
+        <w:jc w:val="both"/>
+        <w:rPr>
+          <w:rFonts w:ascii="Verdana" w:hAnsi="Verdana"/>
+        </w:rPr>
+      </w:pPr>
+      <w:r>
+        <w:rPr>
+          <w:rFonts w:ascii="Verdana" w:hAnsi="Verdana"/>
+        </w:rPr>
+        <w:t xml:space="preserve">Is the below layered architecture correct and why? Is it possible </w:t>
+      </w:r>
+      <w:proofErr w:type="gramStart"/>
+      <w:r>
+        <w:rPr>
+          <w:rFonts w:ascii="Verdana" w:hAnsi="Verdana"/>
+        </w:rPr>
+        <w:t>from</w:t>
+      </w:r>
+      <w:proofErr w:type="gramEnd"/>
+      <w:r>
+        <w:rPr>
+          <w:rFonts w:ascii="Verdana" w:hAnsi="Verdana"/>
+        </w:rPr>
+        <w:t xml:space="preserve"> C to use B? </w:t>
+      </w:r>
+      <w:proofErr w:type="gramStart"/>
+      <w:r>
+        <w:rPr>
+          <w:rFonts w:ascii="Verdana" w:hAnsi="Verdana"/>
+        </w:rPr>
+        <w:t>from</w:t>
+      </w:r>
+      <w:proofErr w:type="gramEnd"/>
+      <w:r>
+        <w:rPr>
+          <w:rFonts w:ascii="Verdana" w:hAnsi="Verdana"/>
+        </w:rPr>
+        <w:t xml:space="preserve"> A </w:t>
+      </w:r>
+      <w:proofErr w:type="gramStart"/>
+      <w:r>
+        <w:rPr>
+          <w:rFonts w:ascii="Verdana" w:hAnsi="Verdana"/>
+        </w:rPr>
+        <w:t>to use</w:t>
+      </w:r>
+      <w:proofErr w:type="gramEnd"/>
+      <w:r>
+        <w:rPr>
+          <w:rFonts w:ascii="Verdana" w:hAnsi="Verdana"/>
+        </w:rPr>
+        <w:t xml:space="preserve"> C?</w:t>
       </w:r>
     </w:p>
     <w:p>
       <w:pPr>
         <w:pStyle w:val="ListParagraph"/>
+        <w:jc w:val="both"/>
         <w:rPr>
           <w:rFonts w:ascii="Verdana" w:hAnsi="Verdana"/>
         </w:rPr>
@@ -1480,6 +1568,7 @@
           <w:ilvl w:val="0"/>
           <w:numId w:val="66"/>
         </w:numPr>
+        <w:jc w:val="both"/>
         <w:rPr>
           <w:rFonts w:ascii="Verdana" w:hAnsi="Verdana"/>
         </w:rPr>
@@ -1494,6 +1583,7 @@
     <w:p>
       <w:pPr>
         <w:pStyle w:val="ListParagraph"/>
+        <w:jc w:val="both"/>
         <w:rPr>
           <w:rFonts w:ascii="Verdana" w:hAnsi="Verdana"/>
         </w:rPr>
@@ -1626,6 +1716,7 @@
           <w:ilvl w:val="0"/>
           <w:numId w:val="66"/>
         </w:numPr>
+        <w:jc w:val="both"/>
         <w:rPr>
           <w:rFonts w:ascii="Verdana" w:hAnsi="Verdana"/>
         </w:rPr>
@@ -1640,6 +1731,7 @@
     <w:p>
       <w:pPr>
         <w:pStyle w:val="ListParagraph"/>
+        <w:jc w:val="both"/>
         <w:rPr>
           <w:rFonts w:ascii="Verdana" w:hAnsi="Verdana"/>
         </w:rPr>
@@ -1775,6 +1867,7 @@
           <w:ilvl w:val="0"/>
           <w:numId w:val="71"/>
         </w:numPr>
+        <w:jc w:val="both"/>
         <w:rPr>
           <w:rFonts w:ascii="Verdana" w:hAnsi="Verdana"/>
         </w:rPr>
@@ -1806,6 +1899,7 @@
           <w:ilvl w:val="0"/>
           <w:numId w:val="71"/>
         </w:numPr>
+        <w:jc w:val="both"/>
         <w:rPr>
           <w:rFonts w:ascii="Verdana" w:hAnsi="Verdana"/>
         </w:rPr>
@@ -1842,6 +1936,7 @@
           <w:ilvl w:val="0"/>
           <w:numId w:val="71"/>
         </w:numPr>
+        <w:jc w:val="both"/>
         <w:rPr>
           <w:rFonts w:ascii="Verdana" w:hAnsi="Verdana"/>
         </w:rPr>
@@ -1896,6 +1991,7 @@
           <w:ilvl w:val="0"/>
           <w:numId w:val="71"/>
         </w:numPr>
+        <w:jc w:val="both"/>
         <w:rPr>
           <w:rFonts w:ascii="Verdana" w:hAnsi="Verdana"/>
         </w:rPr>
@@ -1925,6 +2021,7 @@
           <w:ilvl w:val="0"/>
           <w:numId w:val="66"/>
         </w:numPr>
+        <w:jc w:val="both"/>
         <w:rPr>
           <w:rFonts w:ascii="Verdana" w:hAnsi="Verdana"/>
         </w:rPr>
@@ -1943,6 +2040,7 @@
           <w:ilvl w:val="0"/>
           <w:numId w:val="70"/>
         </w:numPr>
+        <w:jc w:val="both"/>
         <w:rPr>
           <w:rFonts w:ascii="Verdana" w:hAnsi="Verdana"/>
         </w:rPr>
@@ -1978,6 +2076,7 @@
           <w:ilvl w:val="0"/>
           <w:numId w:val="69"/>
         </w:numPr>
+        <w:jc w:val="both"/>
         <w:rPr>
           <w:rFonts w:ascii="Verdana" w:hAnsi="Verdana"/>
         </w:rPr>
@@ -2007,6 +2106,7 @@
           <w:ilvl w:val="0"/>
           <w:numId w:val="69"/>
         </w:numPr>
+        <w:jc w:val="both"/>
         <w:rPr>
           <w:rFonts w:ascii="Verdana" w:hAnsi="Verdana"/>
         </w:rPr>
@@ -2057,20 +2157,50 @@
     <w:p>
       <w:pPr>
         <w:ind w:left="720"/>
-        <w:rPr>
-          <w:rFonts w:ascii="Verdana" w:hAnsi="Verdana"/>
-        </w:rPr>
-      </w:pPr>
-      <w:r>
-        <w:rPr>
-          <w:rFonts w:ascii="Verdana" w:hAnsi="Verdana"/>
-        </w:rPr>
-        <w:t>Testability: Clean Architecture strongly supports testability by enforcing Separation of Concerns and the Dependency Inversion Principle. The Domain and Application layers are isolated from UI and infrastructure, so they can be tested without external dependencies. Interfaces and dependency injection allow mocking of external services or the database in tests.</w:t>
+        <w:jc w:val="both"/>
+        <w:rPr>
+          <w:rFonts w:ascii="Verdana" w:hAnsi="Verdana"/>
+        </w:rPr>
+      </w:pPr>
+      <w:r>
+        <w:rPr>
+          <w:rFonts w:ascii="Verdana" w:hAnsi="Verdana"/>
+        </w:rPr>
+        <w:t xml:space="preserve">Testability: Clean Architecture strongly supports testability by enforcing Separation of Concerns and the Dependency Inversion Principle. The Domain and Application layers are isolated from UI and infrastructure, so they can be tested without external dependencies. Interfaces and dependency </w:t>
+      </w:r>
+      <w:proofErr w:type="gramStart"/>
+      <w:r>
+        <w:rPr>
+          <w:rFonts w:ascii="Verdana" w:hAnsi="Verdana"/>
+        </w:rPr>
+        <w:t>injection</w:t>
+      </w:r>
+      <w:proofErr w:type="gramEnd"/>
+      <w:r>
+        <w:rPr>
+          <w:rFonts w:ascii="Verdana" w:hAnsi="Verdana"/>
+        </w:rPr>
+        <w:t xml:space="preserve"> allow </w:t>
+      </w:r>
+      <w:proofErr w:type="gramStart"/>
+      <w:r>
+        <w:rPr>
+          <w:rFonts w:ascii="Verdana" w:hAnsi="Verdana"/>
+        </w:rPr>
+        <w:t>mocking of</w:t>
+      </w:r>
+      <w:proofErr w:type="gramEnd"/>
+      <w:r>
+        <w:rPr>
+          <w:rFonts w:ascii="Verdana" w:hAnsi="Verdana"/>
+        </w:rPr>
+        <w:t xml:space="preserve"> external services or the database in tests.</w:t>
       </w:r>
     </w:p>
     <w:p>
       <w:pPr>
         <w:ind w:left="720"/>
+        <w:jc w:val="both"/>
         <w:rPr>
           <w:rFonts w:ascii="Verdana" w:hAnsi="Verdana"/>
         </w:rPr>
@@ -2085,6 +2215,7 @@
     <w:p>
       <w:pPr>
         <w:ind w:left="720"/>
+        <w:jc w:val="both"/>
         <w:rPr>
           <w:rFonts w:ascii="Verdana" w:hAnsi="Verdana"/>
         </w:rPr>
@@ -2118,6 +2249,7 @@
     <w:p>
       <w:pPr>
         <w:ind w:left="720"/>
+        <w:jc w:val="both"/>
         <w:rPr>
           <w:rFonts w:ascii="Verdana" w:hAnsi="Verdana"/>
         </w:rPr>

</xml_diff>